<commit_message>
Resumen de sinteticos: detalle tecnico del generador, sus versiones y el evaluador
Co-Authored-By: Claude Opus 5.5 <noreply@anthropic.com>
Claude-Session: https://claude.ai/code/session_01QhZfoeLcg9EPxrL7yxGYpK
</commit_message>
<xml_diff>
--- a/reports/RESUMEN_SINTETICOS.docx
+++ b/reports/RESUMEN_SINTETICOS.docx
@@ -83,7 +83,7 @@
     </w:p>
     <w:tbl>
       <w:tblPr>
-        <w:tblW w:type="dxa" w:w="13397"/>
+        <w:tblW w:type="dxa" w:w="14837"/>
         <w:tblBorders>
           <w:top w:val="single" w:color="auto" w:sz="4"/>
           <w:left w:val="single" w:color="auto" w:sz="4"/>
@@ -96,15 +96,15 @@
       <w:tblGrid>
         <w:gridCol w:w="1700"/>
         <w:gridCol w:w="3300"/>
-        <w:gridCol w:w="933"/>
-        <w:gridCol w:w="933"/>
-        <w:gridCol w:w="933"/>
-        <w:gridCol w:w="933"/>
-        <w:gridCol w:w="933"/>
-        <w:gridCol w:w="933"/>
-        <w:gridCol w:w="933"/>
-        <w:gridCol w:w="933"/>
-        <w:gridCol w:w="933"/>
+        <w:gridCol w:w="1093"/>
+        <w:gridCol w:w="1093"/>
+        <w:gridCol w:w="1093"/>
+        <w:gridCol w:w="1093"/>
+        <w:gridCol w:w="1093"/>
+        <w:gridCol w:w="1093"/>
+        <w:gridCol w:w="1093"/>
+        <w:gridCol w:w="1093"/>
+        <w:gridCol w:w="1093"/>
       </w:tblGrid>
       <w:tr>
         <w:trPr>
@@ -170,7 +170,7 @@
         </w:tc>
         <w:tc>
           <w:tcPr>
-            <w:tcW w:type="dxa" w:w="933"/>
+            <w:tcW w:type="dxa" w:w="1093"/>
             <w:tcBorders>
               <w:top w:val="single" w:color="BFBFBF" w:sz="4"/>
               <w:left w:val="single" w:color="BFBFBF" w:sz="4"/>
@@ -204,7 +204,7 @@
         </w:tc>
         <w:tc>
           <w:tcPr>
-            <w:tcW w:type="dxa" w:w="933"/>
+            <w:tcW w:type="dxa" w:w="1093"/>
             <w:tcBorders>
               <w:top w:val="single" w:color="BFBFBF" w:sz="4"/>
               <w:left w:val="single" w:color="BFBFBF" w:sz="4"/>
@@ -238,7 +238,7 @@
         </w:tc>
         <w:tc>
           <w:tcPr>
-            <w:tcW w:type="dxa" w:w="933"/>
+            <w:tcW w:type="dxa" w:w="1093"/>
             <w:tcBorders>
               <w:top w:val="single" w:color="BFBFBF" w:sz="4"/>
               <w:left w:val="single" w:color="BFBFBF" w:sz="4"/>
@@ -272,7 +272,7 @@
         </w:tc>
         <w:tc>
           <w:tcPr>
-            <w:tcW w:type="dxa" w:w="933"/>
+            <w:tcW w:type="dxa" w:w="1093"/>
             <w:tcBorders>
               <w:top w:val="single" w:color="BFBFBF" w:sz="4"/>
               <w:left w:val="single" w:color="BFBFBF" w:sz="4"/>
@@ -306,7 +306,7 @@
         </w:tc>
         <w:tc>
           <w:tcPr>
-            <w:tcW w:type="dxa" w:w="933"/>
+            <w:tcW w:type="dxa" w:w="1093"/>
             <w:tcBorders>
               <w:top w:val="single" w:color="BFBFBF" w:sz="4"/>
               <w:left w:val="single" w:color="BFBFBF" w:sz="4"/>
@@ -340,7 +340,7 @@
         </w:tc>
         <w:tc>
           <w:tcPr>
-            <w:tcW w:type="dxa" w:w="933"/>
+            <w:tcW w:type="dxa" w:w="1093"/>
             <w:tcBorders>
               <w:top w:val="single" w:color="BFBFBF" w:sz="4"/>
               <w:left w:val="single" w:color="BFBFBF" w:sz="4"/>
@@ -374,7 +374,7 @@
         </w:tc>
         <w:tc>
           <w:tcPr>
-            <w:tcW w:type="dxa" w:w="933"/>
+            <w:tcW w:type="dxa" w:w="1093"/>
             <w:tcBorders>
               <w:top w:val="single" w:color="BFBFBF" w:sz="4"/>
               <w:left w:val="single" w:color="BFBFBF" w:sz="4"/>
@@ -408,7 +408,7 @@
         </w:tc>
         <w:tc>
           <w:tcPr>
-            <w:tcW w:type="dxa" w:w="933"/>
+            <w:tcW w:type="dxa" w:w="1093"/>
             <w:tcBorders>
               <w:top w:val="single" w:color="BFBFBF" w:sz="4"/>
               <w:left w:val="single" w:color="BFBFBF" w:sz="4"/>
@@ -442,7 +442,7 @@
         </w:tc>
         <w:tc>
           <w:tcPr>
-            <w:tcW w:type="dxa" w:w="933"/>
+            <w:tcW w:type="dxa" w:w="1093"/>
             <w:tcBorders>
               <w:top w:val="single" w:color="BFBFBF" w:sz="4"/>
               <w:left w:val="single" w:color="BFBFBF" w:sz="4"/>
@@ -545,7 +545,7 @@
         </w:tc>
         <w:tc>
           <w:tcPr>
-            <w:tcW w:type="dxa" w:w="933"/>
+            <w:tcW w:type="dxa" w:w="1093"/>
             <w:tcBorders>
               <w:top w:val="single" w:color="BFBFBF" w:sz="4"/>
               <w:left w:val="single" w:color="BFBFBF" w:sz="4"/>
@@ -576,7 +576,7 @@
         </w:tc>
         <w:tc>
           <w:tcPr>
-            <w:tcW w:type="dxa" w:w="933"/>
+            <w:tcW w:type="dxa" w:w="1093"/>
             <w:tcBorders>
               <w:top w:val="single" w:color="BFBFBF" w:sz="4"/>
               <w:left w:val="single" w:color="BFBFBF" w:sz="4"/>
@@ -607,7 +607,7 @@
         </w:tc>
         <w:tc>
           <w:tcPr>
-            <w:tcW w:type="dxa" w:w="933"/>
+            <w:tcW w:type="dxa" w:w="1093"/>
             <w:tcBorders>
               <w:top w:val="single" w:color="BFBFBF" w:sz="4"/>
               <w:left w:val="single" w:color="BFBFBF" w:sz="4"/>
@@ -638,7 +638,7 @@
         </w:tc>
         <w:tc>
           <w:tcPr>
-            <w:tcW w:type="dxa" w:w="933"/>
+            <w:tcW w:type="dxa" w:w="1093"/>
             <w:tcBorders>
               <w:top w:val="single" w:color="BFBFBF" w:sz="4"/>
               <w:left w:val="single" w:color="BFBFBF" w:sz="4"/>
@@ -669,7 +669,7 @@
         </w:tc>
         <w:tc>
           <w:tcPr>
-            <w:tcW w:type="dxa" w:w="933"/>
+            <w:tcW w:type="dxa" w:w="1093"/>
             <w:tcBorders>
               <w:top w:val="single" w:color="BFBFBF" w:sz="4"/>
               <w:left w:val="single" w:color="BFBFBF" w:sz="4"/>
@@ -702,7 +702,7 @@
         </w:tc>
         <w:tc>
           <w:tcPr>
-            <w:tcW w:type="dxa" w:w="933"/>
+            <w:tcW w:type="dxa" w:w="1093"/>
             <w:tcBorders>
               <w:top w:val="single" w:color="BFBFBF" w:sz="4"/>
               <w:left w:val="single" w:color="BFBFBF" w:sz="4"/>
@@ -733,7 +733,7 @@
         </w:tc>
         <w:tc>
           <w:tcPr>
-            <w:tcW w:type="dxa" w:w="933"/>
+            <w:tcW w:type="dxa" w:w="1093"/>
             <w:tcBorders>
               <w:top w:val="single" w:color="BFBFBF" w:sz="4"/>
               <w:left w:val="single" w:color="BFBFBF" w:sz="4"/>
@@ -766,7 +766,7 @@
         </w:tc>
         <w:tc>
           <w:tcPr>
-            <w:tcW w:type="dxa" w:w="933"/>
+            <w:tcW w:type="dxa" w:w="1093"/>
             <w:tcBorders>
               <w:top w:val="single" w:color="BFBFBF" w:sz="4"/>
               <w:left w:val="single" w:color="BFBFBF" w:sz="4"/>
@@ -797,7 +797,7 @@
         </w:tc>
         <w:tc>
           <w:tcPr>
-            <w:tcW w:type="dxa" w:w="933"/>
+            <w:tcW w:type="dxa" w:w="1093"/>
             <w:tcBorders>
               <w:top w:val="single" w:color="BFBFBF" w:sz="4"/>
               <w:left w:val="single" w:color="BFBFBF" w:sz="4"/>
@@ -895,7 +895,7 @@
         </w:tc>
         <w:tc>
           <w:tcPr>
-            <w:tcW w:type="dxa" w:w="933"/>
+            <w:tcW w:type="dxa" w:w="1093"/>
             <w:tcBorders>
               <w:top w:val="single" w:color="BFBFBF" w:sz="4"/>
               <w:left w:val="single" w:color="BFBFBF" w:sz="4"/>
@@ -926,7 +926,7 @@
         </w:tc>
         <w:tc>
           <w:tcPr>
-            <w:tcW w:type="dxa" w:w="933"/>
+            <w:tcW w:type="dxa" w:w="1093"/>
             <w:tcBorders>
               <w:top w:val="single" w:color="BFBFBF" w:sz="4"/>
               <w:left w:val="single" w:color="BFBFBF" w:sz="4"/>
@@ -957,7 +957,7 @@
         </w:tc>
         <w:tc>
           <w:tcPr>
-            <w:tcW w:type="dxa" w:w="933"/>
+            <w:tcW w:type="dxa" w:w="1093"/>
             <w:tcBorders>
               <w:top w:val="single" w:color="BFBFBF" w:sz="4"/>
               <w:left w:val="single" w:color="BFBFBF" w:sz="4"/>
@@ -988,7 +988,7 @@
         </w:tc>
         <w:tc>
           <w:tcPr>
-            <w:tcW w:type="dxa" w:w="933"/>
+            <w:tcW w:type="dxa" w:w="1093"/>
             <w:tcBorders>
               <w:top w:val="single" w:color="BFBFBF" w:sz="4"/>
               <w:left w:val="single" w:color="BFBFBF" w:sz="4"/>
@@ -1019,7 +1019,7 @@
         </w:tc>
         <w:tc>
           <w:tcPr>
-            <w:tcW w:type="dxa" w:w="933"/>
+            <w:tcW w:type="dxa" w:w="1093"/>
             <w:tcBorders>
               <w:top w:val="single" w:color="BFBFBF" w:sz="4"/>
               <w:left w:val="single" w:color="BFBFBF" w:sz="4"/>
@@ -1050,7 +1050,7 @@
         </w:tc>
         <w:tc>
           <w:tcPr>
-            <w:tcW w:type="dxa" w:w="933"/>
+            <w:tcW w:type="dxa" w:w="1093"/>
             <w:tcBorders>
               <w:top w:val="single" w:color="BFBFBF" w:sz="4"/>
               <w:left w:val="single" w:color="BFBFBF" w:sz="4"/>
@@ -1081,7 +1081,7 @@
         </w:tc>
         <w:tc>
           <w:tcPr>
-            <w:tcW w:type="dxa" w:w="933"/>
+            <w:tcW w:type="dxa" w:w="1093"/>
             <w:tcBorders>
               <w:top w:val="single" w:color="BFBFBF" w:sz="4"/>
               <w:left w:val="single" w:color="BFBFBF" w:sz="4"/>
@@ -1112,7 +1112,7 @@
         </w:tc>
         <w:tc>
           <w:tcPr>
-            <w:tcW w:type="dxa" w:w="933"/>
+            <w:tcW w:type="dxa" w:w="1093"/>
             <w:tcBorders>
               <w:top w:val="single" w:color="BFBFBF" w:sz="4"/>
               <w:left w:val="single" w:color="BFBFBF" w:sz="4"/>
@@ -1143,7 +1143,7 @@
         </w:tc>
         <w:tc>
           <w:tcPr>
-            <w:tcW w:type="dxa" w:w="933"/>
+            <w:tcW w:type="dxa" w:w="1093"/>
             <w:tcBorders>
               <w:top w:val="single" w:color="BFBFBF" w:sz="4"/>
               <w:left w:val="single" w:color="BFBFBF" w:sz="4"/>
@@ -1239,7 +1239,7 @@
         </w:tc>
         <w:tc>
           <w:tcPr>
-            <w:tcW w:type="dxa" w:w="933"/>
+            <w:tcW w:type="dxa" w:w="1093"/>
             <w:tcBorders>
               <w:top w:val="single" w:color="BFBFBF" w:sz="4"/>
               <w:left w:val="single" w:color="BFBFBF" w:sz="4"/>
@@ -1269,7 +1269,7 @@
         </w:tc>
         <w:tc>
           <w:tcPr>
-            <w:tcW w:type="dxa" w:w="933"/>
+            <w:tcW w:type="dxa" w:w="1093"/>
             <w:tcBorders>
               <w:top w:val="single" w:color="BFBFBF" w:sz="4"/>
               <w:left w:val="single" w:color="BFBFBF" w:sz="4"/>
@@ -1299,7 +1299,7 @@
         </w:tc>
         <w:tc>
           <w:tcPr>
-            <w:tcW w:type="dxa" w:w="933"/>
+            <w:tcW w:type="dxa" w:w="1093"/>
             <w:tcBorders>
               <w:top w:val="single" w:color="BFBFBF" w:sz="4"/>
               <w:left w:val="single" w:color="BFBFBF" w:sz="4"/>
@@ -1329,7 +1329,7 @@
         </w:tc>
         <w:tc>
           <w:tcPr>
-            <w:tcW w:type="dxa" w:w="933"/>
+            <w:tcW w:type="dxa" w:w="1093"/>
             <w:tcBorders>
               <w:top w:val="single" w:color="BFBFBF" w:sz="4"/>
               <w:left w:val="single" w:color="BFBFBF" w:sz="4"/>
@@ -1359,7 +1359,7 @@
         </w:tc>
         <w:tc>
           <w:tcPr>
-            <w:tcW w:type="dxa" w:w="933"/>
+            <w:tcW w:type="dxa" w:w="1093"/>
             <w:tcBorders>
               <w:top w:val="single" w:color="BFBFBF" w:sz="4"/>
               <w:left w:val="single" w:color="BFBFBF" w:sz="4"/>
@@ -1389,7 +1389,7 @@
         </w:tc>
         <w:tc>
           <w:tcPr>
-            <w:tcW w:type="dxa" w:w="933"/>
+            <w:tcW w:type="dxa" w:w="1093"/>
             <w:tcBorders>
               <w:top w:val="single" w:color="BFBFBF" w:sz="4"/>
               <w:left w:val="single" w:color="BFBFBF" w:sz="4"/>
@@ -1419,7 +1419,7 @@
         </w:tc>
         <w:tc>
           <w:tcPr>
-            <w:tcW w:type="dxa" w:w="933"/>
+            <w:tcW w:type="dxa" w:w="1093"/>
             <w:tcBorders>
               <w:top w:val="single" w:color="BFBFBF" w:sz="4"/>
               <w:left w:val="single" w:color="BFBFBF" w:sz="4"/>
@@ -1449,7 +1449,7 @@
         </w:tc>
         <w:tc>
           <w:tcPr>
-            <w:tcW w:type="dxa" w:w="933"/>
+            <w:tcW w:type="dxa" w:w="1093"/>
             <w:tcBorders>
               <w:top w:val="single" w:color="BFBFBF" w:sz="4"/>
               <w:left w:val="single" w:color="BFBFBF" w:sz="4"/>
@@ -1479,7 +1479,7 @@
         </w:tc>
         <w:tc>
           <w:tcPr>
-            <w:tcW w:type="dxa" w:w="933"/>
+            <w:tcW w:type="dxa" w:w="1093"/>
             <w:tcBorders>
               <w:top w:val="single" w:color="BFBFBF" w:sz="4"/>
               <w:left w:val="single" w:color="BFBFBF" w:sz="4"/>
@@ -1574,7 +1574,7 @@
         </w:tc>
         <w:tc>
           <w:tcPr>
-            <w:tcW w:type="dxa" w:w="933"/>
+            <w:tcW w:type="dxa" w:w="1093"/>
             <w:tcBorders>
               <w:top w:val="single" w:color="BFBFBF" w:sz="4"/>
               <w:left w:val="single" w:color="BFBFBF" w:sz="4"/>
@@ -1604,7 +1604,7 @@
         </w:tc>
         <w:tc>
           <w:tcPr>
-            <w:tcW w:type="dxa" w:w="933"/>
+            <w:tcW w:type="dxa" w:w="1093"/>
             <w:tcBorders>
               <w:top w:val="single" w:color="BFBFBF" w:sz="4"/>
               <w:left w:val="single" w:color="BFBFBF" w:sz="4"/>
@@ -1634,7 +1634,7 @@
         </w:tc>
         <w:tc>
           <w:tcPr>
-            <w:tcW w:type="dxa" w:w="933"/>
+            <w:tcW w:type="dxa" w:w="1093"/>
             <w:tcBorders>
               <w:top w:val="single" w:color="BFBFBF" w:sz="4"/>
               <w:left w:val="single" w:color="BFBFBF" w:sz="4"/>
@@ -1664,7 +1664,7 @@
         </w:tc>
         <w:tc>
           <w:tcPr>
-            <w:tcW w:type="dxa" w:w="933"/>
+            <w:tcW w:type="dxa" w:w="1093"/>
             <w:tcBorders>
               <w:top w:val="single" w:color="BFBFBF" w:sz="4"/>
               <w:left w:val="single" w:color="BFBFBF" w:sz="4"/>
@@ -1694,7 +1694,7 @@
         </w:tc>
         <w:tc>
           <w:tcPr>
-            <w:tcW w:type="dxa" w:w="933"/>
+            <w:tcW w:type="dxa" w:w="1093"/>
             <w:tcBorders>
               <w:top w:val="single" w:color="BFBFBF" w:sz="4"/>
               <w:left w:val="single" w:color="BFBFBF" w:sz="4"/>
@@ -1724,7 +1724,7 @@
         </w:tc>
         <w:tc>
           <w:tcPr>
-            <w:tcW w:type="dxa" w:w="933"/>
+            <w:tcW w:type="dxa" w:w="1093"/>
             <w:tcBorders>
               <w:top w:val="single" w:color="BFBFBF" w:sz="4"/>
               <w:left w:val="single" w:color="BFBFBF" w:sz="4"/>
@@ -1754,7 +1754,7 @@
         </w:tc>
         <w:tc>
           <w:tcPr>
-            <w:tcW w:type="dxa" w:w="933"/>
+            <w:tcW w:type="dxa" w:w="1093"/>
             <w:tcBorders>
               <w:top w:val="single" w:color="BFBFBF" w:sz="4"/>
               <w:left w:val="single" w:color="BFBFBF" w:sz="4"/>
@@ -1784,7 +1784,7 @@
         </w:tc>
         <w:tc>
           <w:tcPr>
-            <w:tcW w:type="dxa" w:w="933"/>
+            <w:tcW w:type="dxa" w:w="1093"/>
             <w:tcBorders>
               <w:top w:val="single" w:color="BFBFBF" w:sz="4"/>
               <w:left w:val="single" w:color="BFBFBF" w:sz="4"/>
@@ -1814,7 +1814,7 @@
         </w:tc>
         <w:tc>
           <w:tcPr>
-            <w:tcW w:type="dxa" w:w="933"/>
+            <w:tcW w:type="dxa" w:w="1093"/>
             <w:tcBorders>
               <w:top w:val="single" w:color="BFBFBF" w:sz="4"/>
               <w:left w:val="single" w:color="BFBFBF" w:sz="4"/>
@@ -1909,7 +1909,7 @@
         </w:tc>
         <w:tc>
           <w:tcPr>
-            <w:tcW w:type="dxa" w:w="933"/>
+            <w:tcW w:type="dxa" w:w="1093"/>
             <w:tcBorders>
               <w:top w:val="single" w:color="BFBFBF" w:sz="4"/>
               <w:left w:val="single" w:color="BFBFBF" w:sz="4"/>
@@ -1939,7 +1939,7 @@
         </w:tc>
         <w:tc>
           <w:tcPr>
-            <w:tcW w:type="dxa" w:w="933"/>
+            <w:tcW w:type="dxa" w:w="1093"/>
             <w:tcBorders>
               <w:top w:val="single" w:color="BFBFBF" w:sz="4"/>
               <w:left w:val="single" w:color="BFBFBF" w:sz="4"/>
@@ -1971,7 +1971,7 @@
         </w:tc>
         <w:tc>
           <w:tcPr>
-            <w:tcW w:type="dxa" w:w="933"/>
+            <w:tcW w:type="dxa" w:w="1093"/>
             <w:tcBorders>
               <w:top w:val="single" w:color="BFBFBF" w:sz="4"/>
               <w:left w:val="single" w:color="BFBFBF" w:sz="4"/>
@@ -2003,7 +2003,7 @@
         </w:tc>
         <w:tc>
           <w:tcPr>
-            <w:tcW w:type="dxa" w:w="933"/>
+            <w:tcW w:type="dxa" w:w="1093"/>
             <w:tcBorders>
               <w:top w:val="single" w:color="BFBFBF" w:sz="4"/>
               <w:left w:val="single" w:color="BFBFBF" w:sz="4"/>
@@ -2035,7 +2035,7 @@
         </w:tc>
         <w:tc>
           <w:tcPr>
-            <w:tcW w:type="dxa" w:w="933"/>
+            <w:tcW w:type="dxa" w:w="1093"/>
             <w:tcBorders>
               <w:top w:val="single" w:color="BFBFBF" w:sz="4"/>
               <w:left w:val="single" w:color="BFBFBF" w:sz="4"/>
@@ -2065,7 +2065,7 @@
         </w:tc>
         <w:tc>
           <w:tcPr>
-            <w:tcW w:type="dxa" w:w="933"/>
+            <w:tcW w:type="dxa" w:w="1093"/>
             <w:tcBorders>
               <w:top w:val="single" w:color="BFBFBF" w:sz="4"/>
               <w:left w:val="single" w:color="BFBFBF" w:sz="4"/>
@@ -2095,7 +2095,7 @@
         </w:tc>
         <w:tc>
           <w:tcPr>
-            <w:tcW w:type="dxa" w:w="933"/>
+            <w:tcW w:type="dxa" w:w="1093"/>
             <w:tcBorders>
               <w:top w:val="single" w:color="BFBFBF" w:sz="4"/>
               <w:left w:val="single" w:color="BFBFBF" w:sz="4"/>
@@ -2125,7 +2125,7 @@
         </w:tc>
         <w:tc>
           <w:tcPr>
-            <w:tcW w:type="dxa" w:w="933"/>
+            <w:tcW w:type="dxa" w:w="1093"/>
             <w:tcBorders>
               <w:top w:val="single" w:color="BFBFBF" w:sz="4"/>
               <w:left w:val="single" w:color="BFBFBF" w:sz="4"/>
@@ -2155,7 +2155,7 @@
         </w:tc>
         <w:tc>
           <w:tcPr>
-            <w:tcW w:type="dxa" w:w="933"/>
+            <w:tcW w:type="dxa" w:w="1093"/>
             <w:tcBorders>
               <w:top w:val="single" w:color="BFBFBF" w:sz="4"/>
               <w:left w:val="single" w:color="BFBFBF" w:sz="4"/>
@@ -2250,7 +2250,7 @@
         </w:tc>
         <w:tc>
           <w:tcPr>
-            <w:tcW w:type="dxa" w:w="933"/>
+            <w:tcW w:type="dxa" w:w="1093"/>
             <w:tcBorders>
               <w:top w:val="single" w:color="BFBFBF" w:sz="4"/>
               <w:left w:val="single" w:color="BFBFBF" w:sz="4"/>
@@ -2280,7 +2280,7 @@
         </w:tc>
         <w:tc>
           <w:tcPr>
-            <w:tcW w:type="dxa" w:w="933"/>
+            <w:tcW w:type="dxa" w:w="1093"/>
             <w:tcBorders>
               <w:top w:val="single" w:color="BFBFBF" w:sz="4"/>
               <w:left w:val="single" w:color="BFBFBF" w:sz="4"/>
@@ -2310,7 +2310,7 @@
         </w:tc>
         <w:tc>
           <w:tcPr>
-            <w:tcW w:type="dxa" w:w="933"/>
+            <w:tcW w:type="dxa" w:w="1093"/>
             <w:tcBorders>
               <w:top w:val="single" w:color="BFBFBF" w:sz="4"/>
               <w:left w:val="single" w:color="BFBFBF" w:sz="4"/>
@@ -2340,7 +2340,7 @@
         </w:tc>
         <w:tc>
           <w:tcPr>
-            <w:tcW w:type="dxa" w:w="933"/>
+            <w:tcW w:type="dxa" w:w="1093"/>
             <w:tcBorders>
               <w:top w:val="single" w:color="BFBFBF" w:sz="4"/>
               <w:left w:val="single" w:color="BFBFBF" w:sz="4"/>
@@ -2370,7 +2370,7 @@
         </w:tc>
         <w:tc>
           <w:tcPr>
-            <w:tcW w:type="dxa" w:w="933"/>
+            <w:tcW w:type="dxa" w:w="1093"/>
             <w:tcBorders>
               <w:top w:val="single" w:color="BFBFBF" w:sz="4"/>
               <w:left w:val="single" w:color="BFBFBF" w:sz="4"/>
@@ -2400,7 +2400,7 @@
         </w:tc>
         <w:tc>
           <w:tcPr>
-            <w:tcW w:type="dxa" w:w="933"/>
+            <w:tcW w:type="dxa" w:w="1093"/>
             <w:tcBorders>
               <w:top w:val="single" w:color="BFBFBF" w:sz="4"/>
               <w:left w:val="single" w:color="BFBFBF" w:sz="4"/>
@@ -2430,7 +2430,7 @@
         </w:tc>
         <w:tc>
           <w:tcPr>
-            <w:tcW w:type="dxa" w:w="933"/>
+            <w:tcW w:type="dxa" w:w="1093"/>
             <w:tcBorders>
               <w:top w:val="single" w:color="BFBFBF" w:sz="4"/>
               <w:left w:val="single" w:color="BFBFBF" w:sz="4"/>
@@ -2460,7 +2460,7 @@
         </w:tc>
         <w:tc>
           <w:tcPr>
-            <w:tcW w:type="dxa" w:w="933"/>
+            <w:tcW w:type="dxa" w:w="1093"/>
             <w:tcBorders>
               <w:top w:val="single" w:color="BFBFBF" w:sz="4"/>
               <w:left w:val="single" w:color="BFBFBF" w:sz="4"/>
@@ -2490,7 +2490,7 @@
         </w:tc>
         <w:tc>
           <w:tcPr>
-            <w:tcW w:type="dxa" w:w="933"/>
+            <w:tcW w:type="dxa" w:w="1093"/>
             <w:tcBorders>
               <w:top w:val="single" w:color="BFBFBF" w:sz="4"/>
               <w:left w:val="single" w:color="BFBFBF" w:sz="4"/>
@@ -2585,7 +2585,7 @@
         </w:tc>
         <w:tc>
           <w:tcPr>
-            <w:tcW w:type="dxa" w:w="933"/>
+            <w:tcW w:type="dxa" w:w="1093"/>
             <w:tcBorders>
               <w:top w:val="single" w:color="BFBFBF" w:sz="4"/>
               <w:left w:val="single" w:color="BFBFBF" w:sz="4"/>
@@ -2615,7 +2615,7 @@
         </w:tc>
         <w:tc>
           <w:tcPr>
-            <w:tcW w:type="dxa" w:w="933"/>
+            <w:tcW w:type="dxa" w:w="1093"/>
             <w:tcBorders>
               <w:top w:val="single" w:color="BFBFBF" w:sz="4"/>
               <w:left w:val="single" w:color="BFBFBF" w:sz="4"/>
@@ -2645,7 +2645,7 @@
         </w:tc>
         <w:tc>
           <w:tcPr>
-            <w:tcW w:type="dxa" w:w="933"/>
+            <w:tcW w:type="dxa" w:w="1093"/>
             <w:tcBorders>
               <w:top w:val="single" w:color="BFBFBF" w:sz="4"/>
               <w:left w:val="single" w:color="BFBFBF" w:sz="4"/>
@@ -2675,7 +2675,7 @@
         </w:tc>
         <w:tc>
           <w:tcPr>
-            <w:tcW w:type="dxa" w:w="933"/>
+            <w:tcW w:type="dxa" w:w="1093"/>
             <w:tcBorders>
               <w:top w:val="single" w:color="BFBFBF" w:sz="4"/>
               <w:left w:val="single" w:color="BFBFBF" w:sz="4"/>
@@ -2705,7 +2705,7 @@
         </w:tc>
         <w:tc>
           <w:tcPr>
-            <w:tcW w:type="dxa" w:w="933"/>
+            <w:tcW w:type="dxa" w:w="1093"/>
             <w:tcBorders>
               <w:top w:val="single" w:color="BFBFBF" w:sz="4"/>
               <w:left w:val="single" w:color="BFBFBF" w:sz="4"/>
@@ -2735,7 +2735,7 @@
         </w:tc>
         <w:tc>
           <w:tcPr>
-            <w:tcW w:type="dxa" w:w="933"/>
+            <w:tcW w:type="dxa" w:w="1093"/>
             <w:tcBorders>
               <w:top w:val="single" w:color="BFBFBF" w:sz="4"/>
               <w:left w:val="single" w:color="BFBFBF" w:sz="4"/>
@@ -2765,7 +2765,7 @@
         </w:tc>
         <w:tc>
           <w:tcPr>
-            <w:tcW w:type="dxa" w:w="933"/>
+            <w:tcW w:type="dxa" w:w="1093"/>
             <w:tcBorders>
               <w:top w:val="single" w:color="BFBFBF" w:sz="4"/>
               <w:left w:val="single" w:color="BFBFBF" w:sz="4"/>
@@ -2795,7 +2795,7 @@
         </w:tc>
         <w:tc>
           <w:tcPr>
-            <w:tcW w:type="dxa" w:w="933"/>
+            <w:tcW w:type="dxa" w:w="1093"/>
             <w:tcBorders>
               <w:top w:val="single" w:color="BFBFBF" w:sz="4"/>
               <w:left w:val="single" w:color="BFBFBF" w:sz="4"/>
@@ -2825,7 +2825,7 @@
         </w:tc>
         <w:tc>
           <w:tcPr>
-            <w:tcW w:type="dxa" w:w="933"/>
+            <w:tcW w:type="dxa" w:w="1093"/>
             <w:tcBorders>
               <w:top w:val="single" w:color="BFBFBF" w:sz="4"/>
               <w:left w:val="single" w:color="BFBFBF" w:sz="4"/>
@@ -3088,7 +3088,426 @@
         <w:pStyle w:val="Heading1"/>
       </w:pPr>
       <w:r>
-        <w:t xml:space="preserve">Problemas que generan los sintéticos (resumen)</w:t>
+        <w:t xml:space="preserve">Detalle técnico de lo que se hizo</w:t>
+      </w:r>
+    </w:p>
+    <w:p>
+      <w:pPr>
+        <w:spacing w:after="160" w:line="300"/>
+        <w:jc w:val="left"/>
+      </w:pPr>
+      <w:r>
+        <w:t xml:space="preserve">Todo el trabajo con sintéticos está en cuatro scripts de Python dentro de </w:t>
+      </w:r>
+      <w:r>
+        <w:rPr>
+          <w:rFonts w:ascii="Consolas" w:cs="Consolas" w:eastAsia="Consolas" w:hAnsi="Consolas"/>
+        </w:rPr>
+        <w:t xml:space="preserve">tools/</w:t>
+      </w:r>
+      <w:r>
+        <w:t xml:space="preserve">. Las cinco versiones (v1 a v5) </w:t>
+      </w:r>
+      <w:r>
+        <w:rPr>
+          <w:b/>
+          <w:bCs/>
+        </w:rPr>
+        <w:t xml:space="preserve">no son cinco programas distintos</w:t>
+      </w:r>
+      <w:r>
+        <w:t xml:space="preserve">: son el mismo generador, </w:t>
+      </w:r>
+      <w:r>
+        <w:rPr>
+          <w:rFonts w:ascii="Consolas" w:cs="Consolas" w:eastAsia="Consolas" w:hAnsi="Consolas"/>
+        </w:rPr>
+        <w:t xml:space="preserve">generar_sinteticos.py</w:t>
+      </w:r>
+      <w:r>
+        <w:t xml:space="preserve">, que se fue modificando entre corridas. Cada versión quedó guardada como un commit del repositorio, junto con su CSV de salida y su reporte, así que cualquiera puede reproducirla.</w:t>
+      </w:r>
+    </w:p>
+    <w:tbl>
+      <w:tblPr>
+        <w:tblW w:type="dxa" w:w="9506"/>
+        <w:tblBorders>
+          <w:top w:val="single" w:color="auto" w:sz="4"/>
+          <w:left w:val="single" w:color="auto" w:sz="4"/>
+          <w:bottom w:val="single" w:color="auto" w:sz="4"/>
+          <w:right w:val="single" w:color="auto" w:sz="4"/>
+          <w:insideH w:val="single" w:color="auto" w:sz="4"/>
+          <w:insideV w:val="single" w:color="auto" w:sz="4"/>
+        </w:tblBorders>
+      </w:tblPr>
+      <w:tblGrid>
+        <w:gridCol w:w="2900"/>
+        <w:gridCol w:w="6606"/>
+      </w:tblGrid>
+      <w:tr>
+        <w:trPr>
+          <w:tblHeader/>
+        </w:trPr>
+        <w:tc>
+          <w:tcPr>
+            <w:tcW w:type="dxa" w:w="2900"/>
+            <w:tcBorders>
+              <w:top w:val="single" w:color="BFBFBF" w:sz="4"/>
+              <w:left w:val="single" w:color="BFBFBF" w:sz="4"/>
+              <w:bottom w:val="single" w:color="BFBFBF" w:sz="4"/>
+              <w:right w:val="single" w:color="BFBFBF" w:sz="4"/>
+            </w:tcBorders>
+            <w:shd w:fill="1F3864" w:color="auto" w:val="clear"/>
+            <w:tcMar>
+              <w:top w:type="dxa" w:w="60"/>
+              <w:left w:type="dxa" w:w="80"/>
+              <w:bottom w:type="dxa" w:w="60"/>
+              <w:right w:type="dxa" w:w="80"/>
+            </w:tcMar>
+            <w:vAlign w:val="center"/>
+          </w:tcPr>
+          <w:p>
+            <w:pPr>
+              <w:jc w:val="left"/>
+            </w:pPr>
+            <w:r>
+              <w:rPr>
+                <w:b/>
+                <w:bCs/>
+                <w:color w:val="FFFFFF"/>
+                <w:sz w:val="19"/>
+                <w:szCs w:val="19"/>
+              </w:rPr>
+              <w:t xml:space="preserve">Script</w:t>
+            </w:r>
+          </w:p>
+        </w:tc>
+        <w:tc>
+          <w:tcPr>
+            <w:tcW w:type="dxa" w:w="6606"/>
+            <w:tcBorders>
+              <w:top w:val="single" w:color="BFBFBF" w:sz="4"/>
+              <w:left w:val="single" w:color="BFBFBF" w:sz="4"/>
+              <w:bottom w:val="single" w:color="BFBFBF" w:sz="4"/>
+              <w:right w:val="single" w:color="BFBFBF" w:sz="4"/>
+            </w:tcBorders>
+            <w:shd w:fill="1F3864" w:color="auto" w:val="clear"/>
+            <w:tcMar>
+              <w:top w:type="dxa" w:w="60"/>
+              <w:left w:type="dxa" w:w="80"/>
+              <w:bottom w:type="dxa" w:w="60"/>
+              <w:right w:type="dxa" w:w="80"/>
+            </w:tcMar>
+            <w:vAlign w:val="center"/>
+          </w:tcPr>
+          <w:p>
+            <w:pPr>
+              <w:jc w:val="left"/>
+            </w:pPr>
+            <w:r>
+              <w:rPr>
+                <w:b/>
+                <w:bCs/>
+                <w:color w:val="FFFFFF"/>
+                <w:sz w:val="19"/>
+                <w:szCs w:val="19"/>
+              </w:rPr>
+              <w:t xml:space="preserve">Para qué sirve</w:t>
+            </w:r>
+          </w:p>
+        </w:tc>
+      </w:tr>
+      <w:tr>
+        <w:trPr>
+          <w:tblHeader w:val="false"/>
+        </w:trPr>
+        <w:tc>
+          <w:tcPr>
+            <w:tcW w:type="dxa" w:w="2900"/>
+            <w:tcBorders>
+              <w:top w:val="single" w:color="BFBFBF" w:sz="4"/>
+              <w:left w:val="single" w:color="BFBFBF" w:sz="4"/>
+              <w:bottom w:val="single" w:color="BFBFBF" w:sz="4"/>
+              <w:right w:val="single" w:color="BFBFBF" w:sz="4"/>
+            </w:tcBorders>
+            <w:tcMar>
+              <w:top w:type="dxa" w:w="60"/>
+              <w:left w:type="dxa" w:w="80"/>
+              <w:bottom w:type="dxa" w:w="60"/>
+              <w:right w:type="dxa" w:w="80"/>
+            </w:tcMar>
+            <w:vAlign w:val="center"/>
+          </w:tcPr>
+          <w:p>
+            <w:pPr>
+              <w:jc w:val="left"/>
+            </w:pPr>
+            <w:r>
+              <w:rPr>
+                <w:rFonts w:ascii="Consolas" w:cs="Consolas" w:eastAsia="Consolas" w:hAnsi="Consolas"/>
+                <w:sz w:val="19"/>
+                <w:szCs w:val="19"/>
+              </w:rPr>
+              <w:t xml:space="preserve">generar_sinteticos.py</w:t>
+            </w:r>
+          </w:p>
+        </w:tc>
+        <w:tc>
+          <w:tcPr>
+            <w:tcW w:type="dxa" w:w="6606"/>
+            <w:tcBorders>
+              <w:top w:val="single" w:color="BFBFBF" w:sz="4"/>
+              <w:left w:val="single" w:color="BFBFBF" w:sz="4"/>
+              <w:bottom w:val="single" w:color="BFBFBF" w:sz="4"/>
+              <w:right w:val="single" w:color="BFBFBF" w:sz="4"/>
+            </w:tcBorders>
+            <w:tcMar>
+              <w:top w:type="dxa" w:w="60"/>
+              <w:left w:type="dxa" w:w="80"/>
+              <w:bottom w:type="dxa" w:w="60"/>
+              <w:right w:type="dxa" w:w="80"/>
+            </w:tcMar>
+            <w:vAlign w:val="center"/>
+          </w:tcPr>
+          <w:p>
+            <w:pPr>
+              <w:jc w:val="left"/>
+            </w:pPr>
+            <w:r>
+              <w:rPr>
+                <w:sz w:val="19"/>
+                <w:szCs w:val="19"/>
+              </w:rPr>
+              <w:t xml:space="preserve">Arma el pedido, llama a la API de Claude, valida la respuesta y guarda los hosts sintéticos en un CSV.</w:t>
+            </w:r>
+          </w:p>
+        </w:tc>
+      </w:tr>
+      <w:tr>
+        <w:trPr>
+          <w:tblHeader w:val="false"/>
+        </w:trPr>
+        <w:tc>
+          <w:tcPr>
+            <w:tcW w:type="dxa" w:w="2900"/>
+            <w:tcBorders>
+              <w:top w:val="single" w:color="BFBFBF" w:sz="4"/>
+              <w:left w:val="single" w:color="BFBFBF" w:sz="4"/>
+              <w:bottom w:val="single" w:color="BFBFBF" w:sz="4"/>
+              <w:right w:val="single" w:color="BFBFBF" w:sz="4"/>
+            </w:tcBorders>
+            <w:tcMar>
+              <w:top w:type="dxa" w:w="60"/>
+              <w:left w:type="dxa" w:w="80"/>
+              <w:bottom w:type="dxa" w:w="60"/>
+              <w:right w:type="dxa" w:w="80"/>
+            </w:tcMar>
+            <w:vAlign w:val="center"/>
+          </w:tcPr>
+          <w:p>
+            <w:pPr>
+              <w:jc w:val="left"/>
+            </w:pPr>
+            <w:r>
+              <w:rPr>
+                <w:rFonts w:ascii="Consolas" w:cs="Consolas" w:eastAsia="Consolas" w:hAnsi="Consolas"/>
+                <w:sz w:val="19"/>
+                <w:szCs w:val="19"/>
+              </w:rPr>
+              <w:t xml:space="preserve">evaluar_sinteticos.py</w:t>
+            </w:r>
+          </w:p>
+        </w:tc>
+        <w:tc>
+          <w:tcPr>
+            <w:tcW w:type="dxa" w:w="6606"/>
+            <w:tcBorders>
+              <w:top w:val="single" w:color="BFBFBF" w:sz="4"/>
+              <w:left w:val="single" w:color="BFBFBF" w:sz="4"/>
+              <w:bottom w:val="single" w:color="BFBFBF" w:sz="4"/>
+              <w:right w:val="single" w:color="BFBFBF" w:sz="4"/>
+            </w:tcBorders>
+            <w:tcMar>
+              <w:top w:type="dxa" w:w="60"/>
+              <w:left w:type="dxa" w:w="80"/>
+              <w:bottom w:type="dxa" w:w="60"/>
+              <w:right w:type="dxa" w:w="80"/>
+            </w:tcMar>
+            <w:vAlign w:val="center"/>
+          </w:tcPr>
+          <w:p>
+            <w:pPr>
+              <w:jc w:val="left"/>
+            </w:pPr>
+            <w:r>
+              <w:rPr>
+                <w:sz w:val="19"/>
+                <w:szCs w:val="19"/>
+              </w:rPr>
+              <w:t xml:space="preserve">Aplica los cinco controles de calidad (integridad, fidelidad, diversidad, firma y utilidad) y escribe el reporte.</w:t>
+            </w:r>
+          </w:p>
+        </w:tc>
+      </w:tr>
+      <w:tr>
+        <w:trPr>
+          <w:tblHeader w:val="false"/>
+        </w:trPr>
+        <w:tc>
+          <w:tcPr>
+            <w:tcW w:type="dxa" w:w="2900"/>
+            <w:tcBorders>
+              <w:top w:val="single" w:color="BFBFBF" w:sz="4"/>
+              <w:left w:val="single" w:color="BFBFBF" w:sz="4"/>
+              <w:bottom w:val="single" w:color="BFBFBF" w:sz="4"/>
+              <w:right w:val="single" w:color="BFBFBF" w:sz="4"/>
+            </w:tcBorders>
+            <w:tcMar>
+              <w:top w:type="dxa" w:w="60"/>
+              <w:left w:type="dxa" w:w="80"/>
+              <w:bottom w:type="dxa" w:w="60"/>
+              <w:right w:type="dxa" w:w="80"/>
+            </w:tcMar>
+            <w:vAlign w:val="center"/>
+          </w:tcPr>
+          <w:p>
+            <w:pPr>
+              <w:jc w:val="left"/>
+            </w:pPr>
+            <w:r>
+              <w:rPr>
+                <w:rFonts w:ascii="Consolas" w:cs="Consolas" w:eastAsia="Consolas" w:hAnsi="Consolas"/>
+                <w:sz w:val="19"/>
+                <w:szCs w:val="19"/>
+              </w:rPr>
+              <w:t xml:space="preserve">moldes_dificiles.py</w:t>
+            </w:r>
+          </w:p>
+        </w:tc>
+        <w:tc>
+          <w:tcPr>
+            <w:tcW w:type="dxa" w:w="6606"/>
+            <w:tcBorders>
+              <w:top w:val="single" w:color="BFBFBF" w:sz="4"/>
+              <w:left w:val="single" w:color="BFBFBF" w:sz="4"/>
+              <w:bottom w:val="single" w:color="BFBFBF" w:sz="4"/>
+              <w:right w:val="single" w:color="BFBFBF" w:sz="4"/>
+            </w:tcBorders>
+            <w:tcMar>
+              <w:top w:type="dxa" w:w="60"/>
+              <w:left w:type="dxa" w:w="80"/>
+              <w:bottom w:type="dxa" w:w="60"/>
+              <w:right w:type="dxa" w:w="80"/>
+            </w:tcMar>
+            <w:vAlign w:val="center"/>
+          </w:tcPr>
+          <w:p>
+            <w:pPr>
+              <w:jc w:val="left"/>
+            </w:pPr>
+            <w:r>
+              <w:rPr>
+                <w:sz w:val="19"/>
+                <w:szCs w:val="19"/>
+              </w:rPr>
+              <w:t xml:space="preserve">Encuentra los phishing de entrenamiento que el detector no detecta (los usan v4 y v5).</w:t>
+            </w:r>
+          </w:p>
+        </w:tc>
+      </w:tr>
+      <w:tr>
+        <w:trPr>
+          <w:tblHeader w:val="false"/>
+        </w:trPr>
+        <w:tc>
+          <w:tcPr>
+            <w:tcW w:type="dxa" w:w="2900"/>
+            <w:tcBorders>
+              <w:top w:val="single" w:color="BFBFBF" w:sz="4"/>
+              <w:left w:val="single" w:color="BFBFBF" w:sz="4"/>
+              <w:bottom w:val="single" w:color="BFBFBF" w:sz="4"/>
+              <w:right w:val="single" w:color="BFBFBF" w:sz="4"/>
+            </w:tcBorders>
+            <w:tcMar>
+              <w:top w:type="dxa" w:w="60"/>
+              <w:left w:type="dxa" w:w="80"/>
+              <w:bottom w:type="dxa" w:w="60"/>
+              <w:right w:type="dxa" w:w="80"/>
+            </w:tcMar>
+            <w:vAlign w:val="center"/>
+          </w:tcPr>
+          <w:p>
+            <w:pPr>
+              <w:jc w:val="left"/>
+            </w:pPr>
+            <w:r>
+              <w:rPr>
+                <w:rFonts w:ascii="Consolas" w:cs="Consolas" w:eastAsia="Consolas" w:hAnsi="Consolas"/>
+                <w:sz w:val="19"/>
+                <w:szCs w:val="19"/>
+              </w:rPr>
+              <w:t xml:space="preserve">test_generar_sinteticos.py</w:t>
+            </w:r>
+          </w:p>
+        </w:tc>
+        <w:tc>
+          <w:tcPr>
+            <w:tcW w:type="dxa" w:w="6606"/>
+            <w:tcBorders>
+              <w:top w:val="single" w:color="BFBFBF" w:sz="4"/>
+              <w:left w:val="single" w:color="BFBFBF" w:sz="4"/>
+              <w:bottom w:val="single" w:color="BFBFBF" w:sz="4"/>
+              <w:right w:val="single" w:color="BFBFBF" w:sz="4"/>
+            </w:tcBorders>
+            <w:tcMar>
+              <w:top w:type="dxa" w:w="60"/>
+              <w:left w:type="dxa" w:w="80"/>
+              <w:bottom w:type="dxa" w:w="60"/>
+              <w:right w:type="dxa" w:w="80"/>
+            </w:tcMar>
+            <w:vAlign w:val="center"/>
+          </w:tcPr>
+          <w:p>
+            <w:pPr>
+              <w:jc w:val="left"/>
+            </w:pPr>
+            <w:r>
+              <w:rPr>
+                <w:sz w:val="19"/>
+                <w:szCs w:val="19"/>
+              </w:rPr>
+              <w:t xml:space="preserve">Prueba de punta a punta del generador sin gastar API: simula el servidor de Claude en la propia máquina.</w:t>
+            </w:r>
+          </w:p>
+        </w:tc>
+      </w:tr>
+    </w:tbl>
+    <w:p/>
+    <w:p>
+      <w:pPr>
+        <w:pStyle w:val="Heading2"/>
+      </w:pPr>
+      <w:r>
+        <w:t xml:space="preserve">Cómo funciona el generador, paso a paso</w:t>
+      </w:r>
+    </w:p>
+    <w:p>
+      <w:pPr>
+        <w:spacing w:after="160" w:line="300"/>
+        <w:jc w:val="left"/>
+      </w:pPr>
+      <w:r>
+        <w:t xml:space="preserve">Cada corrida pide </w:t>
+      </w:r>
+      <w:r>
+        <w:rPr>
+          <w:i/>
+          <w:iCs/>
+        </w:rPr>
+        <w:t xml:space="preserve">N</w:t>
+      </w:r>
+      <w:r>
+        <w:t xml:space="preserve"> lotes de 25 hostnames. Cada lote recorre los mismos cinco pasos:</w:t>
       </w:r>
     </w:p>
     <w:p>
@@ -3105,10 +3524,140 @@
           <w:b/>
           <w:bCs/>
         </w:rPr>
-        <w:t xml:space="preserve">Firma del generador</w:t>
-      </w:r>
-      <w:r>
-        <w:t xml:space="preserve">: sin calibración, el LLM produce un estilo propio, reconocible (AUC 0.98).</w:t>
+        <w:t xml:space="preserve">Carga y calibración</w:t>
+      </w:r>
+      <w:r>
+        <w:t xml:space="preserve"> (</w:t>
+      </w:r>
+      <w:r>
+        <w:rPr>
+          <w:rFonts w:ascii="Consolas" w:cs="Consolas" w:eastAsia="Consolas" w:hAnsi="Consolas"/>
+        </w:rPr>
+        <w:t xml:space="preserve">cargar</w:t>
+      </w:r>
+      <w:r>
+        <w:t xml:space="preserve">, </w:t>
+      </w:r>
+      <w:r>
+        <w:rPr>
+          <w:rFonts w:ascii="Consolas" w:cs="Consolas" w:eastAsia="Consolas" w:hAnsi="Consolas"/>
+        </w:rPr>
+        <w:t xml:space="preserve">forma_de</w:t>
+      </w:r>
+      <w:r>
+        <w:t xml:space="preserve">, </w:t>
+      </w:r>
+      <w:r>
+        <w:rPr>
+          <w:rFonts w:ascii="Consolas" w:cs="Consolas" w:eastAsia="Consolas" w:hAnsi="Consolas"/>
+        </w:rPr>
+        <w:t xml:space="preserve">calibracion</w:t>
+      </w:r>
+      <w:r>
+        <w:t xml:space="preserve">). Se lee el CSV combinado y se toman </w:t>
+      </w:r>
+      <w:r>
+        <w:rPr>
+          <w:b/>
+          <w:bCs/>
+        </w:rPr>
+        <w:t xml:space="preserve">solo los phishing del split de entrenamiento</w:t>
+      </w:r>
+      <w:r>
+        <w:t xml:space="preserve">, para que el generador nunca vea ejemplos del test. </w:t>
+      </w:r>
+      <w:r>
+        <w:rPr>
+          <w:rFonts w:ascii="Consolas" w:cs="Consolas" w:eastAsia="Consolas" w:hAnsi="Consolas"/>
+        </w:rPr>
+        <w:t xml:space="preserve">forma_de</w:t>
+      </w:r>
+      <w:r>
+        <w:t xml:space="preserve"> clasifica cada host en una de tres formas: </w:t>
+      </w:r>
+      <w:r>
+        <w:rPr>
+          <w:i/>
+          <w:iCs/>
+        </w:rPr>
+        <w:t xml:space="preserve">apex</w:t>
+      </w:r>
+      <w:r>
+        <w:t xml:space="preserve"> (dominio propio sin subdominios, como </w:t>
+      </w:r>
+      <w:r>
+        <w:rPr>
+          <w:rFonts w:ascii="Consolas" w:cs="Consolas" w:eastAsia="Consolas" w:hAnsi="Consolas"/>
+        </w:rPr>
+        <w:t xml:space="preserve">itaucardigital.com</w:t>
+      </w:r>
+      <w:r>
+        <w:t xml:space="preserve">), </w:t>
+      </w:r>
+      <w:r>
+        <w:rPr>
+          <w:i/>
+          <w:iCs/>
+        </w:rPr>
+        <w:t xml:space="preserve">sub_ajeno</w:t>
+      </w:r>
+      <w:r>
+        <w:t xml:space="preserve"> (subdominio sobre un dominio ajeno a la marca, como </w:t>
+      </w:r>
+      <w:r>
+        <w:rPr>
+          <w:rFonts w:ascii="Consolas" w:cs="Consolas" w:eastAsia="Consolas" w:hAnsi="Consolas"/>
+        </w:rPr>
+        <w:t xml:space="preserve">americanas.divulgapromo.ml</w:t>
+      </w:r>
+      <w:r>
+        <w:t xml:space="preserve">) o </w:t>
+      </w:r>
+      <w:r>
+        <w:rPr>
+          <w:i/>
+          <w:iCs/>
+        </w:rPr>
+        <w:t xml:space="preserve">plataforma</w:t>
+      </w:r>
+      <w:r>
+        <w:t xml:space="preserve"> (subdominio de un hosting gratuito, como </w:t>
+      </w:r>
+      <w:r>
+        <w:rPr>
+          <w:rFonts w:ascii="Consolas" w:cs="Consolas" w:eastAsia="Consolas" w:hAnsi="Consolas"/>
+        </w:rPr>
+        <w:t xml:space="preserve">netflix-cop.vercel.app</w:t>
+      </w:r>
+      <w:r>
+        <w:t xml:space="preserve">). </w:t>
+      </w:r>
+      <w:r>
+        <w:rPr>
+          <w:rFonts w:ascii="Consolas" w:cs="Consolas" w:eastAsia="Consolas" w:hAnsi="Consolas"/>
+        </w:rPr>
+        <w:t xml:space="preserve">calibracion</w:t>
+      </w:r>
+      <w:r>
+        <w:t xml:space="preserve"> calcula las proporciones reales del corpus: qué porcentaje hay de cada forma, de cada sufijo (</w:t>
+      </w:r>
+      <w:r>
+        <w:rPr>
+          <w:rFonts w:ascii="Consolas" w:cs="Consolas" w:eastAsia="Consolas" w:hAnsi="Consolas"/>
+        </w:rPr>
+        <w:t xml:space="preserve">.com</w:t>
+      </w:r>
+      <w:r>
+        <w:t xml:space="preserve">, </w:t>
+      </w:r>
+      <w:r>
+        <w:rPr>
+          <w:rFonts w:ascii="Consolas" w:cs="Consolas" w:eastAsia="Consolas" w:hAnsi="Consolas"/>
+        </w:rPr>
+        <w:t xml:space="preserve">.com.br</w:t>
+      </w:r>
+      <w:r>
+        <w:t xml:space="preserve">...), de cada plataforma y de cada marca, y los percentiles de largo del hostname.</w:t>
       </w:r>
     </w:p>
     <w:p>
@@ -3125,10 +3674,19 @@
           <w:b/>
           <w:bCs/>
         </w:rPr>
-        <w:t xml:space="preserve">Atajos (shortcut learning)</w:t>
-      </w:r>
-      <w:r>
-        <w:t xml:space="preserve">: el detector puede aprender rasgos del generador en vez de rasgos del phishing, lo que sube los falsos positivos en sitios legítimos con esos rasgos.</w:t>
+        <w:t xml:space="preserve">Plan del lote</w:t>
+      </w:r>
+      <w:r>
+        <w:t xml:space="preserve"> (</w:t>
+      </w:r>
+      <w:r>
+        <w:rPr>
+          <w:rFonts w:ascii="Consolas" w:cs="Consolas" w:eastAsia="Consolas" w:hAnsi="Consolas"/>
+        </w:rPr>
+        <w:t xml:space="preserve">plan_lote</w:t>
+      </w:r>
+      <w:r>
+        <w:t xml:space="preserve">). Antes de llamar al modelo, el script decide qué tiene que tener cada uno de los 25 hosts (forma, marca, sufijo o plataforma), muestreando al azar con las proporciones del corpus. El modelo no decide la distribución: la decide el plan. Así el lote sintético respeta las mismas proporciones que el phishing real.</w:t>
       </w:r>
     </w:p>
     <w:p>
@@ -3145,10 +3703,83 @@
           <w:b/>
           <w:bCs/>
         </w:rPr>
-        <w:t xml:space="preserve">Redundancia</w:t>
-      </w:r>
-      <w:r>
-        <w:t xml:space="preserve">: si el sintético es indistinguible del real, equivale a sobremuestrear y no aporta información.</w:t>
+        <w:t xml:space="preserve">Armado del prompt</w:t>
+      </w:r>
+      <w:r>
+        <w:t xml:space="preserve"> (</w:t>
+      </w:r>
+      <w:r>
+        <w:rPr>
+          <w:rFonts w:ascii="Consolas" w:cs="Consolas" w:eastAsia="Consolas" w:hAnsi="Consolas"/>
+        </w:rPr>
+        <w:t xml:space="preserve">SYSTEM</w:t>
+      </w:r>
+      <w:r>
+        <w:t xml:space="preserve">, </w:t>
+      </w:r>
+      <w:r>
+        <w:rPr>
+          <w:rFonts w:ascii="Consolas" w:cs="Consolas" w:eastAsia="Consolas" w:hAnsi="Consolas"/>
+        </w:rPr>
+        <w:t xml:space="preserve">prompt_usuario</w:t>
+      </w:r>
+      <w:r>
+        <w:t xml:space="preserve">, </w:t>
+      </w:r>
+      <w:r>
+        <w:rPr>
+          <w:rFonts w:ascii="Consolas" w:cs="Consolas" w:eastAsia="Consolas" w:hAnsi="Consolas"/>
+        </w:rPr>
+        <w:t xml:space="preserve">ejemplos</w:t>
+      </w:r>
+      <w:r>
+        <w:t xml:space="preserve">). El pedido tiene dos partes:</w:t>
+      </w:r>
+    </w:p>
+    <w:p>
+      <w:pPr>
+        <w:pStyle w:val="ListParagraph"/>
+        <w:numPr>
+          <w:ilvl w:val="1"/>
+          <w:numId w:val="2"/>
+        </w:numPr>
+        <w:spacing w:after="60"/>
+      </w:pPr>
+      <w:r>
+        <w:t xml:space="preserve">El </w:t>
+      </w:r>
+      <w:r>
+        <w:rPr>
+          <w:b/>
+          <w:bCs/>
+        </w:rPr>
+        <w:t xml:space="preserve">mensaje de sistema</w:t>
+      </w:r>
+      <w:r>
+        <w:t xml:space="preserve"> fija el contexto (investigación defensiva, los hosts solo se usan para entrenar un clasificador y nunca se registran), las reglas de formato y la definición de las formas.</w:t>
+      </w:r>
+    </w:p>
+    <w:p>
+      <w:pPr>
+        <w:pStyle w:val="ListParagraph"/>
+        <w:numPr>
+          <w:ilvl w:val="1"/>
+          <w:numId w:val="2"/>
+        </w:numPr>
+        <w:spacing w:after="60"/>
+      </w:pPr>
+      <w:r>
+        <w:t xml:space="preserve">El </w:t>
+      </w:r>
+      <w:r>
+        <w:rPr>
+          <w:b/>
+          <w:bCs/>
+        </w:rPr>
+        <w:t xml:space="preserve">mensaje de usuario</w:t>
+      </w:r>
+      <w:r>
+        <w:t xml:space="preserve"> incluye unos 18 ejemplos reales (6 por forma, rotados en cada lote), los percentiles de largo, los últimos 60 hosts ya generados (para que no se repita entre lotes) y el plan como una tabla, una fila por host.</w:t>
       </w:r>
     </w:p>
     <w:p>
@@ -3165,10 +3796,142 @@
           <w:b/>
           <w:bCs/>
         </w:rPr>
-        <w:t xml:space="preserve">Desplazamiento de la frontera</w:t>
-      </w:r>
-      <w:r>
-        <w:t xml:space="preserve">: generar alrededor de los casos difíciles empuja al detector hacia la zona de los legítimos (FPR de 9.4% a ~10.5% en el Random Forest).</w:t>
+        <w:t xml:space="preserve">Llamada a la API</w:t>
+      </w:r>
+      <w:r>
+        <w:t xml:space="preserve"> (</w:t>
+      </w:r>
+      <w:r>
+        <w:rPr>
+          <w:rFonts w:ascii="Consolas" w:cs="Consolas" w:eastAsia="Consolas" w:hAnsi="Consolas"/>
+        </w:rPr>
+        <w:t xml:space="preserve">llamar</w:t>
+      </w:r>
+      <w:r>
+        <w:t xml:space="preserve">). Se usa el SDK oficial </w:t>
+      </w:r>
+      <w:r>
+        <w:rPr>
+          <w:rFonts w:ascii="Consolas" w:cs="Consolas" w:eastAsia="Consolas" w:hAnsi="Consolas"/>
+        </w:rPr>
+        <w:t xml:space="preserve">anthropic</w:t>
+      </w:r>
+      <w:r>
+        <w:t xml:space="preserve"> con </w:t>
+      </w:r>
+      <w:r>
+        <w:rPr>
+          <w:b/>
+          <w:bCs/>
+        </w:rPr>
+        <w:t xml:space="preserve">salida estructurada</w:t>
+      </w:r>
+      <w:r>
+        <w:t xml:space="preserve">: el modelo tiene que devolver un JSON que cumpla un esquema definido con Pydantic (</w:t>
+      </w:r>
+      <w:r>
+        <w:rPr>
+          <w:rFonts w:ascii="Consolas" w:cs="Consolas" w:eastAsia="Consolas" w:hAnsi="Consolas"/>
+        </w:rPr>
+        <w:t xml:space="preserve">HostSintetico</w:t>
+      </w:r>
+      <w:r>
+        <w:t xml:space="preserve">, </w:t>
+      </w:r>
+      <w:r>
+        <w:rPr>
+          <w:rFonts w:ascii="Consolas" w:cs="Consolas" w:eastAsia="Consolas" w:hAnsi="Consolas"/>
+        </w:rPr>
+        <w:t xml:space="preserve">Lote</w:t>
+      </w:r>
+      <w:r>
+        <w:t xml:space="preserve">), con los campos id, hostname, forma, marca y patrón. Eso evita tener que interpretar texto libre. Además:</w:t>
+      </w:r>
+    </w:p>
+    <w:p>
+      <w:pPr>
+        <w:pStyle w:val="ListParagraph"/>
+        <w:numPr>
+          <w:ilvl w:val="1"/>
+          <w:numId w:val="2"/>
+        </w:numPr>
+        <w:spacing w:after="60"/>
+      </w:pPr>
+      <w:r>
+        <w:t xml:space="preserve">el mensaje de sistema se guarda en caché, porque es igual en todos los lotes, y así se abaratan las llamadas;</w:t>
+      </w:r>
+    </w:p>
+    <w:p>
+      <w:pPr>
+        <w:pStyle w:val="ListParagraph"/>
+        <w:numPr>
+          <w:ilvl w:val="1"/>
+          <w:numId w:val="2"/>
+        </w:numPr>
+        <w:spacing w:after="60"/>
+      </w:pPr>
+      <w:r>
+        <w:t xml:space="preserve">no se usa </w:t>
+      </w:r>
+      <w:r>
+        <w:rPr>
+          <w:i/>
+          <w:iCs/>
+        </w:rPr>
+        <w:t xml:space="preserve">temperature</w:t>
+      </w:r>
+      <w:r>
+        <w:t xml:space="preserve">, porque el modelo pedido no la admite: la variedad sale del plan, de los ejemplos rotados y de la lista de hosts ya generados;</w:t>
+      </w:r>
+    </w:p>
+    <w:p>
+      <w:pPr>
+        <w:pStyle w:val="ListParagraph"/>
+        <w:numPr>
+          <w:ilvl w:val="1"/>
+          <w:numId w:val="2"/>
+        </w:numPr>
+        <w:spacing w:after="60"/>
+      </w:pPr>
+      <w:r>
+        <w:t xml:space="preserve">está activado el </w:t>
+      </w:r>
+      <w:r>
+        <w:rPr>
+          <w:b/>
+          <w:bCs/>
+        </w:rPr>
+        <w:t xml:space="preserve">fallback del servidor</w:t>
+      </w:r>
+      <w:r>
+        <w:t xml:space="preserve">: si el filtro de seguridad del modelo pedido (</w:t>
+      </w:r>
+      <w:r>
+        <w:rPr>
+          <w:rFonts w:ascii="Consolas" w:cs="Consolas" w:eastAsia="Consolas" w:hAnsi="Consolas"/>
+        </w:rPr>
+        <w:t xml:space="preserve">claude-opus-5-5</w:t>
+      </w:r>
+      <w:r>
+        <w:t xml:space="preserve">) rechaza el pedido, la API lo reintenta con un modelo de respaldo (</w:t>
+      </w:r>
+      <w:r>
+        <w:rPr>
+          <w:rFonts w:ascii="Consolas" w:cs="Consolas" w:eastAsia="Consolas" w:hAnsi="Consolas"/>
+        </w:rPr>
+        <w:t xml:space="preserve">claude-opus-4-8</w:t>
+      </w:r>
+      <w:r>
+        <w:t xml:space="preserve">). Fue lo que pasó en todos los lotes, y queda registrado en cada fila (</w:t>
+      </w:r>
+      <w:r>
+        <w:rPr>
+          <w:rFonts w:ascii="Consolas" w:cs="Consolas" w:eastAsia="Consolas" w:hAnsi="Consolas"/>
+        </w:rPr>
+        <w:t xml:space="preserve">modelo_servido</w:t>
+      </w:r>
+      <w:r>
+        <w:t xml:space="preserve">).</w:t>
       </w:r>
     </w:p>
     <w:p>
@@ -3185,19 +3948,316 @@
           <w:b/>
           <w:bCs/>
         </w:rPr>
-        <w:t xml:space="preserve">Trazabilidad</w:t>
-      </w:r>
-      <w:r>
-        <w:t xml:space="preserve">: el modelo pedido rechazó los lotes y los sirvió el modelo de respaldo; se registra en cada fila (</w:t>
+        <w:t xml:space="preserve">Validación</w:t>
+      </w:r>
+      <w:r>
+        <w:t xml:space="preserve"> (</w:t>
       </w:r>
       <w:r>
         <w:rPr>
           <w:rFonts w:ascii="Consolas" w:cs="Consolas" w:eastAsia="Consolas" w:hAnsi="Consolas"/>
         </w:rPr>
-        <w:t xml:space="preserve">modelo_servido</w:t>
-      </w:r>
-      <w:r>
-        <w:t xml:space="preserve">) y hay que declararlo en la metodología.</w:t>
+        <w:t xml:space="preserve">validar</w:t>
+      </w:r>
+      <w:r>
+        <w:t xml:space="preserve">, </w:t>
+      </w:r>
+      <w:r>
+        <w:rPr>
+          <w:rFonts w:ascii="Consolas" w:cs="Consolas" w:eastAsia="Consolas" w:hAnsi="Consolas"/>
+        </w:rPr>
+        <w:t xml:space="preserve">motivo_rechazo</w:t>
+      </w:r>
+      <w:r>
+        <w:t xml:space="preserve">). Cada host devuelto se revisa contra su fila del plan y se descarta si:</w:t>
+      </w:r>
+    </w:p>
+    <w:p>
+      <w:pPr>
+        <w:pStyle w:val="ListParagraph"/>
+        <w:numPr>
+          <w:ilvl w:val="1"/>
+          <w:numId w:val="2"/>
+        </w:numPr>
+        <w:spacing w:after="60"/>
+      </w:pPr>
+      <w:r>
+        <w:t xml:space="preserve">no es un hostname válido (expresión regular </w:t>
+      </w:r>
+      <w:r>
+        <w:rPr>
+          <w:rFonts w:ascii="Consolas" w:cs="Consolas" w:eastAsia="Consolas" w:hAnsi="Consolas"/>
+        </w:rPr>
+        <w:t xml:space="preserve">RE_HOST</w:t>
+      </w:r>
+      <w:r>
+        <w:t xml:space="preserve">);</w:t>
+      </w:r>
+    </w:p>
+    <w:p>
+      <w:pPr>
+        <w:pStyle w:val="ListParagraph"/>
+        <w:numPr>
+          <w:ilvl w:val="1"/>
+          <w:numId w:val="2"/>
+        </w:numPr>
+        <w:spacing w:after="60"/>
+      </w:pPr>
+      <w:r>
+        <w:t xml:space="preserve">ya existe en el dataset o ya fue generado (</w:t>
+      </w:r>
+      <w:r>
+        <w:rPr>
+          <w:i/>
+          <w:iCs/>
+        </w:rPr>
+        <w:t xml:space="preserve">duplicado</w:t>
+      </w:r>
+      <w:r>
+        <w:t xml:space="preserve">);</w:t>
+      </w:r>
+    </w:p>
+    <w:p>
+      <w:pPr>
+        <w:pStyle w:val="ListParagraph"/>
+        <w:numPr>
+          <w:ilvl w:val="1"/>
+          <w:numId w:val="2"/>
+        </w:numPr>
+        <w:spacing w:after="60"/>
+      </w:pPr>
+      <w:r>
+        <w:t xml:space="preserve">es una casi-copia: </w:t>
+      </w:r>
+      <w:r>
+        <w:rPr>
+          <w:rFonts w:ascii="Consolas" w:cs="Consolas" w:eastAsia="Consolas" w:hAnsi="Consolas"/>
+        </w:rPr>
+        <w:t xml:space="preserve">esqueleto</w:t>
+      </w:r>
+      <w:r>
+        <w:t xml:space="preserve"> quita dígitos y guiones, así </w:t>
+      </w:r>
+      <w:r>
+        <w:rPr>
+          <w:rFonts w:ascii="Consolas" w:cs="Consolas" w:eastAsia="Consolas" w:hAnsi="Consolas"/>
+        </w:rPr>
+        <w:t xml:space="preserve">americanas-loja34</w:t>
+      </w:r>
+      <w:r>
+        <w:t xml:space="preserve"> y </w:t>
+      </w:r>
+      <w:r>
+        <w:rPr>
+          <w:rFonts w:ascii="Consolas" w:cs="Consolas" w:eastAsia="Consolas" w:hAnsi="Consolas"/>
+        </w:rPr>
+        <w:t xml:space="preserve">americanas-loja35</w:t>
+      </w:r>
+      <w:r>
+        <w:t xml:space="preserve"> cuentan como el mismo host;</w:t>
+      </w:r>
+    </w:p>
+    <w:p>
+      <w:pPr>
+        <w:pStyle w:val="ListParagraph"/>
+        <w:numPr>
+          <w:ilvl w:val="1"/>
+          <w:numId w:val="2"/>
+        </w:numPr>
+        <w:spacing w:after="60"/>
+      </w:pPr>
+      <w:r>
+        <w:t xml:space="preserve">su largo cae fuera del rango real (percentiles 1 a 99);</w:t>
+      </w:r>
+    </w:p>
+    <w:p>
+      <w:pPr>
+        <w:pStyle w:val="ListParagraph"/>
+        <w:numPr>
+          <w:ilvl w:val="1"/>
+          <w:numId w:val="2"/>
+        </w:numPr>
+        <w:spacing w:after="60"/>
+      </w:pPr>
+      <w:r>
+        <w:t xml:space="preserve">no respeta el plan: </w:t>
+      </w:r>
+      <w:r>
+        <w:rPr>
+          <w:rFonts w:ascii="Consolas" w:cs="Consolas" w:eastAsia="Consolas" w:hAnsi="Consolas"/>
+        </w:rPr>
+        <w:t xml:space="preserve">forma_host</w:t>
+      </w:r>
+      <w:r>
+        <w:t xml:space="preserve"> y </w:t>
+      </w:r>
+      <w:r>
+        <w:rPr>
+          <w:rFonts w:ascii="Consolas" w:cs="Consolas" w:eastAsia="Consolas" w:hAnsi="Consolas"/>
+        </w:rPr>
+        <w:t xml:space="preserve">dominio_registrado</w:t>
+      </w:r>
+      <w:r>
+        <w:t xml:space="preserve"> recalculan la forma y el sufijo del host generado con la misma regla que se usó para el corpus, y tienen que coincidir con los de la fila.</w:t>
+      </w:r>
+    </w:p>
+    <w:p>
+      <w:pPr>
+        <w:spacing w:after="160" w:line="300"/>
+        <w:jc w:val="left"/>
+      </w:pPr>
+      <w:r>
+        <w:t xml:space="preserve">Los hosts aceptados se guardan con sus metadatos (</w:t>
+      </w:r>
+      <w:r>
+        <w:rPr>
+          <w:rFonts w:ascii="Consolas" w:cs="Consolas" w:eastAsia="Consolas" w:hAnsi="Consolas"/>
+        </w:rPr>
+        <w:t xml:space="preserve">fuente = sintetico_llm</w:t>
+      </w:r>
+      <w:r>
+        <w:t xml:space="preserve">, </w:t>
+      </w:r>
+      <w:r>
+        <w:rPr>
+          <w:rFonts w:ascii="Consolas" w:cs="Consolas" w:eastAsia="Consolas" w:hAnsi="Consolas"/>
+        </w:rPr>
+        <w:t xml:space="preserve">split = train</w:t>
+      </w:r>
+      <w:r>
+        <w:t xml:space="preserve">, número de lote, modelo pedido y servido, </w:t>
+      </w:r>
+      <w:r>
+        <w:rPr>
+          <w:i/>
+          <w:iCs/>
+        </w:rPr>
+        <w:t xml:space="preserve">effort</w:t>
+      </w:r>
+      <w:r>
+        <w:t xml:space="preserve">). Cada corrida escribe además un JSON de trazabilidad con la configuración exacta (incluido un hash del prompt de sistema), cuántos hosts se pidieron, cuántos se aceptaron y los motivos de descarte. Si el CSV de salida ya existe, el script continúa desde el último lote sin repetir planes.</w:t>
+      </w:r>
+    </w:p>
+    <w:p>
+      <w:pPr>
+        <w:pStyle w:val="Heading2"/>
+      </w:pPr>
+      <w:r>
+        <w:t xml:space="preserve">Qué cambió en cada versión</w:t>
+      </w:r>
+    </w:p>
+    <w:p>
+      <w:pPr>
+        <w:spacing w:after="160" w:line="300"/>
+        <w:jc w:val="left"/>
+      </w:pPr>
+      <w:r>
+        <w:rPr>
+          <w:b/>
+          <w:bCs/>
+        </w:rPr>
+        <w:t xml:space="preserve">v1, plan por marginales.</w:t>
+      </w:r>
+      <w:r>
+        <w:t xml:space="preserve"> Es el generador tal como se describió arriba. Cada atributo del plan se sortea por separado con </w:t>
+      </w:r>
+      <w:r>
+        <w:rPr>
+          <w:rFonts w:ascii="Consolas" w:cs="Consolas" w:eastAsia="Consolas" w:hAnsi="Consolas"/>
+        </w:rPr>
+        <w:t xml:space="preserve">muestrear</w:t>
+      </w:r>
+      <w:r>
+        <w:t xml:space="preserve"> (forma, marca y sufijo, cada uno según su frecuencia en el corpus). Problema: el plan solo controla forma, marca y sufijo; todo lo demás (largo, guiones, vocabulario) lo decide el modelo, y el modelo tiende a un phishing "de manual", largo y descriptivo, como </w:t>
+      </w:r>
+      <w:r>
+        <w:rPr>
+          <w:rFonts w:ascii="Consolas" w:cs="Consolas" w:eastAsia="Consolas" w:hAnsi="Consolas"/>
+        </w:rPr>
+        <w:t xml:space="preserve">soporte-verificar-cuenta-itau.com</w:t>
+      </w:r>
+      <w:r>
+        <w:t xml:space="preserve">.</w:t>
+      </w:r>
+    </w:p>
+    <w:p>
+      <w:pPr>
+        <w:spacing w:after="160" w:line="300"/>
+        <w:jc w:val="left"/>
+      </w:pPr>
+      <w:r>
+        <w:rPr>
+          <w:b/>
+          <w:bCs/>
+        </w:rPr>
+        <w:t xml:space="preserve">v2, perfil real por fila.</w:t>
+      </w:r>
+      <w:r>
+        <w:t xml:space="preserve"> </w:t>
+      </w:r>
+      <w:r>
+        <w:rPr>
+          <w:rFonts w:ascii="Consolas" w:cs="Consolas" w:eastAsia="Consolas" w:hAnsi="Consolas"/>
+        </w:rPr>
+        <w:t xml:space="preserve">calibracion</w:t>
+      </w:r>
+      <w:r>
+        <w:t xml:space="preserve"> guarda además, para cada forma, la lista de </w:t>
+      </w:r>
+      <w:r>
+        <w:rPr>
+          <w:b/>
+          <w:bCs/>
+        </w:rPr>
+        <w:t xml:space="preserve">perfiles reales</w:t>
+      </w:r>
+      <w:r>
+        <w:t xml:space="preserve">: el largo, la cantidad de guiones, la cantidad de dígitos y si lleva palabra gancho de cada host de entrenamiento. </w:t>
+      </w:r>
+      <w:r>
+        <w:rPr>
+          <w:rFonts w:ascii="Consolas" w:cs="Consolas" w:eastAsia="Consolas" w:hAnsi="Consolas"/>
+        </w:rPr>
+        <w:t xml:space="preserve">plan_lote</w:t>
+      </w:r>
+      <w:r>
+        <w:t xml:space="preserve"> copia un perfil al azar a cada fila, y la tabla del prompt suma las columnas </w:t>
+      </w:r>
+      <w:r>
+        <w:rPr>
+          <w:i/>
+          <w:iCs/>
+        </w:rPr>
+        <w:t xml:space="preserve">largo, guiones, dígitos, gancho</w:t>
+      </w:r>
+      <w:r>
+        <w:t xml:space="preserve">. También se reescribió una regla del mensaje de sistema que, sin querer, empujaba al modelo a usar palabras gancho. Resultado: el largo y los guiones quedaron como los reales, pero el </w:t>
+      </w:r>
+      <w:r>
+        <w:rPr>
+          <w:b/>
+          <w:bCs/>
+        </w:rPr>
+        <w:t xml:space="preserve">vocabulario</w:t>
+      </w:r>
+      <w:r>
+        <w:t xml:space="preserve"> seguía delatando al generador.</w:t>
+      </w:r>
+    </w:p>
+    <w:p>
+      <w:pPr>
+        <w:spacing w:after="160" w:line="300"/>
+        <w:jc w:val="left"/>
+      </w:pPr>
+      <w:r>
+        <w:rPr>
+          <w:b/>
+          <w:bCs/>
+        </w:rPr>
+        <w:t xml:space="preserve">v3, molde real por fila.</w:t>
+      </w:r>
+      <w:r>
+        <w:t xml:space="preserve"> Es el cambio más importante. Se agregaron tres funciones:</w:t>
       </w:r>
     </w:p>
     <w:p>
@@ -3205,7 +4265,1268 @@
         <w:pStyle w:val="ListParagraph"/>
         <w:numPr>
           <w:ilvl w:val="0"/>
-          <w:numId w:val="3"/>
+          <w:numId w:val="2"/>
+        </w:numPr>
+        <w:spacing w:after="80"/>
+      </w:pPr>
+      <w:r>
+        <w:rPr>
+          <w:rFonts w:ascii="Consolas" w:cs="Consolas" w:eastAsia="Consolas" w:hAnsi="Consolas"/>
+        </w:rPr>
+        <w:t xml:space="preserve">moldes</w:t>
+      </w:r>
+      <w:r>
+        <w:t xml:space="preserve">: convierte cada phishing real de entrenamiento en un "molde" (1094 de 1114 sirven; se descartan los que la validación no clasificaría igual que el CSV). De cada molde salen </w:t>
+      </w:r>
+      <w:r>
+        <w:rPr>
+          <w:b/>
+          <w:bCs/>
+        </w:rPr>
+        <w:t xml:space="preserve">todos</w:t>
+      </w:r>
+      <w:r>
+        <w:t xml:space="preserve"> los atributos de la fila: forma, marca, sufijo o plataforma, perfil y, en </w:t>
+      </w:r>
+      <w:r>
+        <w:rPr>
+          <w:i/>
+          <w:iCs/>
+        </w:rPr>
+        <w:t xml:space="preserve">sub_ajeno</w:t>
+      </w:r>
+      <w:r>
+        <w:t xml:space="preserve">, el mismo dominio base. Con esto el plan reproduce la distribución </w:t>
+      </w:r>
+      <w:r>
+        <w:rPr>
+          <w:b/>
+          <w:bCs/>
+        </w:rPr>
+        <w:t xml:space="preserve">conjunta</w:t>
+      </w:r>
+      <w:r>
+        <w:t xml:space="preserve"> del corpus, no solo cada atributo por separado. Por ejemplo, si en el corpus Magalu aparece sobre todo en </w:t>
+      </w:r>
+      <w:r>
+        <w:rPr>
+          <w:i/>
+          <w:iCs/>
+        </w:rPr>
+        <w:t xml:space="preserve">apex</w:t>
+      </w:r>
+      <w:r>
+        <w:t xml:space="preserve"> con </w:t>
+      </w:r>
+      <w:r>
+        <w:rPr>
+          <w:rFonts w:ascii="Consolas" w:cs="Consolas" w:eastAsia="Consolas" w:hAnsi="Consolas"/>
+        </w:rPr>
+        <w:t xml:space="preserve">.com</w:t>
+      </w:r>
+      <w:r>
+        <w:t xml:space="preserve">, así aparece en el plan.</w:t>
+      </w:r>
+    </w:p>
+    <w:p>
+      <w:pPr>
+        <w:pStyle w:val="ListParagraph"/>
+        <w:numPr>
+          <w:ilvl w:val="0"/>
+          <w:numId w:val="2"/>
+        </w:numPr>
+        <w:spacing w:after="80"/>
+      </w:pPr>
+      <w:r>
+        <w:rPr>
+          <w:rFonts w:ascii="Consolas" w:cs="Consolas" w:eastAsia="Consolas" w:hAnsi="Consolas"/>
+        </w:rPr>
+        <w:t xml:space="preserve">plan_lote</w:t>
+      </w:r>
+      <w:r>
+        <w:t xml:space="preserve">: ahora elige 25 moldes distintos al azar (</w:t>
+      </w:r>
+      <w:r>
+        <w:rPr>
+          <w:rFonts w:ascii="Consolas" w:cs="Consolas" w:eastAsia="Consolas" w:hAnsi="Consolas"/>
+        </w:rPr>
+        <w:t xml:space="preserve">rng.sample</w:t>
+      </w:r>
+      <w:r>
+        <w:t xml:space="preserve">) y el prompt muestra el molde en la tabla. Se le pide al modelo un host "hermano" del molde: misma construcción (concatenado, gibberish, typosquatting, DNS dinámico...) pero con otro nombre.</w:t>
+      </w:r>
+    </w:p>
+    <w:p>
+      <w:pPr>
+        <w:pStyle w:val="ListParagraph"/>
+        <w:numPr>
+          <w:ilvl w:val="0"/>
+          <w:numId w:val="2"/>
+        </w:numPr>
+        <w:spacing w:after="80"/>
+      </w:pPr>
+      <w:r>
+        <w:rPr>
+          <w:rFonts w:ascii="Consolas" w:cs="Consolas" w:eastAsia="Consolas" w:hAnsi="Consolas"/>
+        </w:rPr>
+        <w:t xml:space="preserve">tokens</w:t>
+      </w:r>
+      <w:r>
+        <w:t xml:space="preserve"> y </w:t>
+      </w:r>
+      <w:r>
+        <w:rPr>
+          <w:rFonts w:ascii="Consolas" w:cs="Consolas" w:eastAsia="Consolas" w:hAnsi="Consolas"/>
+        </w:rPr>
+        <w:t xml:space="preserve">sobreusadas</w:t>
+      </w:r>
+      <w:r>
+        <w:t xml:space="preserve">: parten cada host en palabras y comparan la frecuencia de cada palabra en lo ya generado con su frecuencia en el phishing real. Las palabras que el generador usa al menos 3 veces más que el corpus (por ejemplo </w:t>
+      </w:r>
+      <w:r>
+        <w:rPr>
+          <w:i/>
+          <w:iCs/>
+        </w:rPr>
+        <w:t xml:space="preserve">acesso</w:t>
+      </w:r>
+      <w:r>
+        <w:t xml:space="preserve">, </w:t>
+      </w:r>
+      <w:r>
+        <w:rPr>
+          <w:i/>
+          <w:iCs/>
+        </w:rPr>
+        <w:t xml:space="preserve">reembolso</w:t>
+      </w:r>
+      <w:r>
+        <w:t xml:space="preserve">, </w:t>
+      </w:r>
+      <w:r>
+        <w:rPr>
+          <w:i/>
+          <w:iCs/>
+        </w:rPr>
+        <w:t xml:space="preserve">cliente</w:t>
+      </w:r>
+      <w:r>
+        <w:t xml:space="preserve">) se listan en el prompt como palabras a evitar. Esa lista se recalcula en cada lote.</w:t>
+      </w:r>
+    </w:p>
+    <w:p>
+      <w:pPr>
+        <w:spacing w:after="160" w:line="300"/>
+        <w:jc w:val="left"/>
+      </w:pPr>
+      <w:r>
+        <w:t xml:space="preserve">La validación suma dos reglas: en </w:t>
+      </w:r>
+      <w:r>
+        <w:rPr>
+          <w:i/>
+          <w:iCs/>
+        </w:rPr>
+        <w:t xml:space="preserve">sub_ajeno</w:t>
+      </w:r>
+      <w:r>
+        <w:t xml:space="preserve"> el dominio registrado tiene que ser exactamente el del molde, y el host no puede ser el molde con otros dígitos o guiones (</w:t>
+      </w:r>
+      <w:r>
+        <w:rPr>
+          <w:i/>
+          <w:iCs/>
+        </w:rPr>
+        <w:t xml:space="preserve">copia_del_molde</w:t>
+      </w:r>
+      <w:r>
+        <w:t xml:space="preserve">).</w:t>
+      </w:r>
+    </w:p>
+    <w:p>
+      <w:pPr>
+        <w:spacing w:after="160" w:line="300"/>
+        <w:jc w:val="left"/>
+      </w:pPr>
+      <w:r>
+        <w:rPr>
+          <w:b/>
+          <w:bCs/>
+        </w:rPr>
+        <w:t xml:space="preserve">v4, generación dirigida a los errores.</w:t>
+      </w:r>
+      <w:r>
+        <w:t xml:space="preserve"> Se agregó el script </w:t>
+      </w:r>
+      <w:r>
+        <w:rPr>
+          <w:rFonts w:ascii="Consolas" w:cs="Consolas" w:eastAsia="Consolas" w:hAnsi="Consolas"/>
+        </w:rPr>
+        <w:t xml:space="preserve">moldes_dificiles.py</w:t>
+      </w:r>
+      <w:r>
+        <w:t xml:space="preserve">, que hace una </w:t>
+      </w:r>
+      <w:r>
+        <w:rPr>
+          <w:b/>
+          <w:bCs/>
+        </w:rPr>
+        <w:t xml:space="preserve">validación cruzada de 5 folds</w:t>
+      </w:r>
+      <w:r>
+        <w:t xml:space="preserve"> sobre el entrenamiento, usando los folds que ya trae el CSV. En cada fold entrena el detector (Random Forest de 300 árboles sobre las 20 features léxicas) con los otros cuatro y predice el fold que dejó afuera. Así cada host recibe una probabilidad de phishing de un modelo que nunca lo vio (predicción </w:t>
+      </w:r>
+      <w:r>
+        <w:rPr>
+          <w:i/>
+          <w:iCs/>
+        </w:rPr>
+        <w:t xml:space="preserve">out-of-fold</w:t>
+      </w:r>
+      <w:r>
+        <w:t xml:space="preserve">). Los phishing con probabilidad menor a 0.5 son los </w:t>
+      </w:r>
+      <w:r>
+        <w:rPr>
+          <w:b/>
+          <w:bCs/>
+        </w:rPr>
+        <w:t xml:space="preserve">falsos negativos</w:t>
+      </w:r>
+      <w:r>
+        <w:t xml:space="preserve">: 217 de 1114. El generador recibe esa lista con la opción </w:t>
+      </w:r>
+      <w:r>
+        <w:rPr>
+          <w:rFonts w:ascii="Consolas" w:cs="Consolas" w:eastAsia="Consolas" w:hAnsi="Consolas"/>
+        </w:rPr>
+        <w:t xml:space="preserve">--moldes</w:t>
+      </w:r>
+      <w:r>
+        <w:t xml:space="preserve"> y solo usa esos hosts como moldes. Como el pool es chico, </w:t>
+      </w:r>
+      <w:r>
+        <w:rPr>
+          <w:rFonts w:ascii="Consolas" w:cs="Consolas" w:eastAsia="Consolas" w:hAnsi="Consolas"/>
+        </w:rPr>
+        <w:t xml:space="preserve">plan_lote</w:t>
+      </w:r>
+      <w:r>
+        <w:t xml:space="preserve"> permite repetir un molde entre lotes.</w:t>
+      </w:r>
+    </w:p>
+    <w:p>
+      <w:pPr>
+        <w:spacing w:after="160" w:line="300"/>
+        <w:jc w:val="left"/>
+      </w:pPr>
+      <w:r>
+        <w:rPr>
+          <w:b/>
+          <w:bCs/>
+        </w:rPr>
+        <w:t xml:space="preserve">v5, dirigida y con marca.</w:t>
+      </w:r>
+      <w:r>
+        <w:t xml:space="preserve"> Igual que v4, pero </w:t>
+      </w:r>
+      <w:r>
+        <w:rPr>
+          <w:rFonts w:ascii="Consolas" w:cs="Consolas" w:eastAsia="Consolas" w:hAnsi="Consolas"/>
+        </w:rPr>
+        <w:t xml:space="preserve">moldes_dificiles.py --solo-con-marca</w:t>
+      </w:r>
+      <w:r>
+        <w:t xml:space="preserve"> se queda solo con los 89 falsos negativos que imitan una marca, que son los que tienen alguna señal léxica que aprender (por ejemplo </w:t>
+      </w:r>
+      <w:r>
+        <w:rPr>
+          <w:rFonts w:ascii="Consolas" w:cs="Consolas" w:eastAsia="Consolas" w:hAnsi="Consolas"/>
+        </w:rPr>
+        <w:t xml:space="preserve">magalulu.com</w:t>
+      </w:r>
+      <w:r>
+        <w:t xml:space="preserve">), y descarta los que no tienen ninguna pista en el nombre (por ejemplo </w:t>
+      </w:r>
+      <w:r>
+        <w:rPr>
+          <w:rFonts w:ascii="Consolas" w:cs="Consolas" w:eastAsia="Consolas" w:hAnsi="Consolas"/>
+        </w:rPr>
+        <w:t xml:space="preserve">skylark.ch</w:t>
+      </w:r>
+      <w:r>
+        <w:t xml:space="preserve">).</w:t>
+      </w:r>
+    </w:p>
+    <w:p>
+      <w:pPr>
+        <w:pStyle w:val="Heading2"/>
+      </w:pPr>
+      <w:r>
+        <w:t xml:space="preserve">Cómo funciona el evaluador</w:t>
+      </w:r>
+    </w:p>
+    <w:p>
+      <w:pPr>
+        <w:spacing w:after="160" w:line="300"/>
+        <w:jc w:val="left"/>
+      </w:pPr>
+      <w:r>
+        <w:rPr>
+          <w:rFonts w:ascii="Consolas" w:cs="Consolas" w:eastAsia="Consolas" w:hAnsi="Consolas"/>
+        </w:rPr>
+        <w:t xml:space="preserve">evaluar_sinteticos.py</w:t>
+      </w:r>
+      <w:r>
+        <w:t xml:space="preserve"> recalcula las features de </w:t>
+      </w:r>
+      <w:r>
+        <w:rPr>
+          <w:b/>
+          <w:bCs/>
+        </w:rPr>
+        <w:t xml:space="preserve">todos</w:t>
+      </w:r>
+      <w:r>
+        <w:t xml:space="preserve"> los hosts (reales y sintéticos) con la misma función, </w:t>
+      </w:r>
+      <w:r>
+        <w:rPr>
+          <w:rFonts w:ascii="Consolas" w:cs="Consolas" w:eastAsia="Consolas" w:hAnsi="Consolas"/>
+        </w:rPr>
+        <w:t xml:space="preserve">extract_features</w:t>
+      </w:r>
+      <w:r>
+        <w:t xml:space="preserve"> de </w:t>
+      </w:r>
+      <w:r>
+        <w:rPr>
+          <w:rFonts w:ascii="Consolas" w:cs="Consolas" w:eastAsia="Consolas" w:hAnsi="Consolas"/>
+        </w:rPr>
+        <w:t xml:space="preserve">src/features.py</w:t>
+      </w:r>
+      <w:r>
+        <w:t xml:space="preserve">, para que ambos grupos pasen por el mismo pipeline.</w:t>
+      </w:r>
+    </w:p>
+    <w:tbl>
+      <w:tblPr>
+        <w:tblW w:type="dxa" w:w="9506"/>
+        <w:tblBorders>
+          <w:top w:val="single" w:color="auto" w:sz="4"/>
+          <w:left w:val="single" w:color="auto" w:sz="4"/>
+          <w:bottom w:val="single" w:color="auto" w:sz="4"/>
+          <w:right w:val="single" w:color="auto" w:sz="4"/>
+          <w:insideH w:val="single" w:color="auto" w:sz="4"/>
+          <w:insideV w:val="single" w:color="auto" w:sz="4"/>
+        </w:tblBorders>
+      </w:tblPr>
+      <w:tblGrid>
+        <w:gridCol w:w="1400"/>
+        <w:gridCol w:w="2300"/>
+        <w:gridCol w:w="5806"/>
+      </w:tblGrid>
+      <w:tr>
+        <w:trPr>
+          <w:tblHeader/>
+        </w:trPr>
+        <w:tc>
+          <w:tcPr>
+            <w:tcW w:type="dxa" w:w="1400"/>
+            <w:tcBorders>
+              <w:top w:val="single" w:color="BFBFBF" w:sz="4"/>
+              <w:left w:val="single" w:color="BFBFBF" w:sz="4"/>
+              <w:bottom w:val="single" w:color="BFBFBF" w:sz="4"/>
+              <w:right w:val="single" w:color="BFBFBF" w:sz="4"/>
+            </w:tcBorders>
+            <w:shd w:fill="1F3864" w:color="auto" w:val="clear"/>
+            <w:tcMar>
+              <w:top w:type="dxa" w:w="60"/>
+              <w:left w:type="dxa" w:w="80"/>
+              <w:bottom w:type="dxa" w:w="60"/>
+              <w:right w:type="dxa" w:w="80"/>
+            </w:tcMar>
+            <w:vAlign w:val="center"/>
+          </w:tcPr>
+          <w:p>
+            <w:pPr>
+              <w:jc w:val="left"/>
+            </w:pPr>
+            <w:r>
+              <w:rPr>
+                <w:b/>
+                <w:bCs/>
+                <w:color w:val="FFFFFF"/>
+                <w:sz w:val="19"/>
+                <w:szCs w:val="19"/>
+              </w:rPr>
+              <w:t xml:space="preserve">Control</w:t>
+            </w:r>
+          </w:p>
+        </w:tc>
+        <w:tc>
+          <w:tcPr>
+            <w:tcW w:type="dxa" w:w="2300"/>
+            <w:tcBorders>
+              <w:top w:val="single" w:color="BFBFBF" w:sz="4"/>
+              <w:left w:val="single" w:color="BFBFBF" w:sz="4"/>
+              <w:bottom w:val="single" w:color="BFBFBF" w:sz="4"/>
+              <w:right w:val="single" w:color="BFBFBF" w:sz="4"/>
+            </w:tcBorders>
+            <w:shd w:fill="1F3864" w:color="auto" w:val="clear"/>
+            <w:tcMar>
+              <w:top w:type="dxa" w:w="60"/>
+              <w:left w:type="dxa" w:w="80"/>
+              <w:bottom w:type="dxa" w:w="60"/>
+              <w:right w:type="dxa" w:w="80"/>
+            </w:tcMar>
+            <w:vAlign w:val="center"/>
+          </w:tcPr>
+          <w:p>
+            <w:pPr>
+              <w:jc w:val="left"/>
+            </w:pPr>
+            <w:r>
+              <w:rPr>
+                <w:b/>
+                <w:bCs/>
+                <w:color w:val="FFFFFF"/>
+                <w:sz w:val="19"/>
+                <w:szCs w:val="19"/>
+              </w:rPr>
+              <w:t xml:space="preserve">Función</w:t>
+            </w:r>
+          </w:p>
+        </w:tc>
+        <w:tc>
+          <w:tcPr>
+            <w:tcW w:type="dxa" w:w="5806"/>
+            <w:tcBorders>
+              <w:top w:val="single" w:color="BFBFBF" w:sz="4"/>
+              <w:left w:val="single" w:color="BFBFBF" w:sz="4"/>
+              <w:bottom w:val="single" w:color="BFBFBF" w:sz="4"/>
+              <w:right w:val="single" w:color="BFBFBF" w:sz="4"/>
+            </w:tcBorders>
+            <w:shd w:fill="1F3864" w:color="auto" w:val="clear"/>
+            <w:tcMar>
+              <w:top w:type="dxa" w:w="60"/>
+              <w:left w:type="dxa" w:w="80"/>
+              <w:bottom w:type="dxa" w:w="60"/>
+              <w:right w:type="dxa" w:w="80"/>
+            </w:tcMar>
+            <w:vAlign w:val="center"/>
+          </w:tcPr>
+          <w:p>
+            <w:pPr>
+              <w:jc w:val="left"/>
+            </w:pPr>
+            <w:r>
+              <w:rPr>
+                <w:b/>
+                <w:bCs/>
+                <w:color w:val="FFFFFF"/>
+                <w:sz w:val="19"/>
+                <w:szCs w:val="19"/>
+              </w:rPr>
+              <w:t xml:space="preserve">Cómo se mide</w:t>
+            </w:r>
+          </w:p>
+        </w:tc>
+      </w:tr>
+      <w:tr>
+        <w:trPr>
+          <w:tblHeader w:val="false"/>
+        </w:trPr>
+        <w:tc>
+          <w:tcPr>
+            <w:tcW w:type="dxa" w:w="1400"/>
+            <w:tcBorders>
+              <w:top w:val="single" w:color="BFBFBF" w:sz="4"/>
+              <w:left w:val="single" w:color="BFBFBF" w:sz="4"/>
+              <w:bottom w:val="single" w:color="BFBFBF" w:sz="4"/>
+              <w:right w:val="single" w:color="BFBFBF" w:sz="4"/>
+            </w:tcBorders>
+            <w:tcMar>
+              <w:top w:type="dxa" w:w="60"/>
+              <w:left w:type="dxa" w:w="80"/>
+              <w:bottom w:type="dxa" w:w="60"/>
+              <w:right w:type="dxa" w:w="80"/>
+            </w:tcMar>
+            <w:vAlign w:val="center"/>
+          </w:tcPr>
+          <w:p>
+            <w:pPr>
+              <w:jc w:val="left"/>
+            </w:pPr>
+            <w:r>
+              <w:rPr>
+                <w:sz w:val="19"/>
+                <w:szCs w:val="19"/>
+              </w:rPr>
+              <w:t xml:space="preserve">Integridad</w:t>
+            </w:r>
+          </w:p>
+        </w:tc>
+        <w:tc>
+          <w:tcPr>
+            <w:tcW w:type="dxa" w:w="2300"/>
+            <w:tcBorders>
+              <w:top w:val="single" w:color="BFBFBF" w:sz="4"/>
+              <w:left w:val="single" w:color="BFBFBF" w:sz="4"/>
+              <w:bottom w:val="single" w:color="BFBFBF" w:sz="4"/>
+              <w:right w:val="single" w:color="BFBFBF" w:sz="4"/>
+            </w:tcBorders>
+            <w:tcMar>
+              <w:top w:type="dxa" w:w="60"/>
+              <w:left w:type="dxa" w:w="80"/>
+              <w:bottom w:type="dxa" w:w="60"/>
+              <w:right w:type="dxa" w:w="80"/>
+            </w:tcMar>
+            <w:vAlign w:val="center"/>
+          </w:tcPr>
+          <w:p>
+            <w:pPr>
+              <w:jc w:val="left"/>
+            </w:pPr>
+            <w:r>
+              <w:rPr>
+                <w:rFonts w:ascii="Consolas" w:cs="Consolas" w:eastAsia="Consolas" w:hAnsi="Consolas"/>
+                <w:sz w:val="19"/>
+                <w:szCs w:val="19"/>
+              </w:rPr>
+              <w:t xml:space="preserve">integridad</w:t>
+            </w:r>
+          </w:p>
+        </w:tc>
+        <w:tc>
+          <w:tcPr>
+            <w:tcW w:type="dxa" w:w="5806"/>
+            <w:tcBorders>
+              <w:top w:val="single" w:color="BFBFBF" w:sz="4"/>
+              <w:left w:val="single" w:color="BFBFBF" w:sz="4"/>
+              <w:bottom w:val="single" w:color="BFBFBF" w:sz="4"/>
+              <w:right w:val="single" w:color="BFBFBF" w:sz="4"/>
+            </w:tcBorders>
+            <w:tcMar>
+              <w:top w:type="dxa" w:w="60"/>
+              <w:left w:type="dxa" w:w="80"/>
+              <w:bottom w:type="dxa" w:w="60"/>
+              <w:right w:type="dxa" w:w="80"/>
+            </w:tcMar>
+            <w:vAlign w:val="center"/>
+          </w:tcPr>
+          <w:p>
+            <w:pPr>
+              <w:jc w:val="left"/>
+            </w:pPr>
+            <w:r>
+              <w:rPr>
+                <w:sz w:val="19"/>
+                <w:szCs w:val="19"/>
+              </w:rPr>
+              <w:t xml:space="preserve">Cuenta hosts inválidos, duplicados, ya presentes en el dataset y casi-copias. Para detectar </w:t>
+            </w:r>
+            <w:r>
+              <w:rPr>
+                <w:b/>
+                <w:bCs/>
+                <w:sz w:val="19"/>
+                <w:szCs w:val="19"/>
+              </w:rPr>
+              <w:t xml:space="preserve">fuga hacia el test</w:t>
+            </w:r>
+            <w:r>
+              <w:rPr>
+                <w:sz w:val="19"/>
+                <w:szCs w:val="19"/>
+              </w:rPr>
+              <w:t xml:space="preserve"> busca, para cada sintético, el host de valid/test más parecido (vecino más cercano con similitud coseno sobre n-gramas de 2 a 4 caracteres) y cuenta cuántos están a distancia de edición (Levenshtein) de 1 o menos.</w:t>
+            </w:r>
+          </w:p>
+        </w:tc>
+      </w:tr>
+      <w:tr>
+        <w:trPr>
+          <w:tblHeader w:val="false"/>
+        </w:trPr>
+        <w:tc>
+          <w:tcPr>
+            <w:tcW w:type="dxa" w:w="1400"/>
+            <w:tcBorders>
+              <w:top w:val="single" w:color="BFBFBF" w:sz="4"/>
+              <w:left w:val="single" w:color="BFBFBF" w:sz="4"/>
+              <w:bottom w:val="single" w:color="BFBFBF" w:sz="4"/>
+              <w:right w:val="single" w:color="BFBFBF" w:sz="4"/>
+            </w:tcBorders>
+            <w:tcMar>
+              <w:top w:type="dxa" w:w="60"/>
+              <w:left w:type="dxa" w:w="80"/>
+              <w:bottom w:type="dxa" w:w="60"/>
+              <w:right w:type="dxa" w:w="80"/>
+            </w:tcMar>
+            <w:vAlign w:val="center"/>
+          </w:tcPr>
+          <w:p>
+            <w:pPr>
+              <w:jc w:val="left"/>
+            </w:pPr>
+            <w:r>
+              <w:rPr>
+                <w:sz w:val="19"/>
+                <w:szCs w:val="19"/>
+              </w:rPr>
+              <w:t xml:space="preserve">Fidelidad</w:t>
+            </w:r>
+          </w:p>
+        </w:tc>
+        <w:tc>
+          <w:tcPr>
+            <w:tcW w:type="dxa" w:w="2300"/>
+            <w:tcBorders>
+              <w:top w:val="single" w:color="BFBFBF" w:sz="4"/>
+              <w:left w:val="single" w:color="BFBFBF" w:sz="4"/>
+              <w:bottom w:val="single" w:color="BFBFBF" w:sz="4"/>
+              <w:right w:val="single" w:color="BFBFBF" w:sz="4"/>
+            </w:tcBorders>
+            <w:tcMar>
+              <w:top w:type="dxa" w:w="60"/>
+              <w:left w:type="dxa" w:w="80"/>
+              <w:bottom w:type="dxa" w:w="60"/>
+              <w:right w:type="dxa" w:w="80"/>
+            </w:tcMar>
+            <w:vAlign w:val="center"/>
+          </w:tcPr>
+          <w:p>
+            <w:pPr>
+              <w:jc w:val="left"/>
+            </w:pPr>
+            <w:r>
+              <w:rPr>
+                <w:rFonts w:ascii="Consolas" w:cs="Consolas" w:eastAsia="Consolas" w:hAnsi="Consolas"/>
+                <w:sz w:val="19"/>
+                <w:szCs w:val="19"/>
+              </w:rPr>
+              <w:t xml:space="preserve">fidelidad</w:t>
+            </w:r>
+          </w:p>
+        </w:tc>
+        <w:tc>
+          <w:tcPr>
+            <w:tcW w:type="dxa" w:w="5806"/>
+            <w:tcBorders>
+              <w:top w:val="single" w:color="BFBFBF" w:sz="4"/>
+              <w:left w:val="single" w:color="BFBFBF" w:sz="4"/>
+              <w:bottom w:val="single" w:color="BFBFBF" w:sz="4"/>
+              <w:right w:val="single" w:color="BFBFBF" w:sz="4"/>
+            </w:tcBorders>
+            <w:tcMar>
+              <w:top w:type="dxa" w:w="60"/>
+              <w:left w:type="dxa" w:w="80"/>
+              <w:bottom w:type="dxa" w:w="60"/>
+              <w:right w:type="dxa" w:w="80"/>
+            </w:tcMar>
+            <w:vAlign w:val="center"/>
+          </w:tcPr>
+          <w:p>
+            <w:pPr>
+              <w:jc w:val="left"/>
+            </w:pPr>
+            <w:r>
+              <w:rPr>
+                <w:sz w:val="19"/>
+                <w:szCs w:val="19"/>
+              </w:rPr>
+              <w:t xml:space="preserve">Para cada una de las 20 features compara la distribución sintética con la real mediante el estadístico </w:t>
+            </w:r>
+            <w:r>
+              <w:rPr>
+                <w:b/>
+                <w:bCs/>
+                <w:sz w:val="19"/>
+                <w:szCs w:val="19"/>
+              </w:rPr>
+              <w:t xml:space="preserve">Kolmogorov-Smirnov</w:t>
+            </w:r>
+            <w:r>
+              <w:rPr>
+                <w:sz w:val="19"/>
+                <w:szCs w:val="19"/>
+              </w:rPr>
+              <w:t xml:space="preserve"> (KS: la mayor distancia entre las dos curvas acumuladas; 0 = idénticas). Se reporta la mediana de los 20 valores.</w:t>
+            </w:r>
+          </w:p>
+        </w:tc>
+      </w:tr>
+      <w:tr>
+        <w:trPr>
+          <w:tblHeader w:val="false"/>
+        </w:trPr>
+        <w:tc>
+          <w:tcPr>
+            <w:tcW w:type="dxa" w:w="1400"/>
+            <w:tcBorders>
+              <w:top w:val="single" w:color="BFBFBF" w:sz="4"/>
+              <w:left w:val="single" w:color="BFBFBF" w:sz="4"/>
+              <w:bottom w:val="single" w:color="BFBFBF" w:sz="4"/>
+              <w:right w:val="single" w:color="BFBFBF" w:sz="4"/>
+            </w:tcBorders>
+            <w:tcMar>
+              <w:top w:type="dxa" w:w="60"/>
+              <w:left w:type="dxa" w:w="80"/>
+              <w:bottom w:type="dxa" w:w="60"/>
+              <w:right w:type="dxa" w:w="80"/>
+            </w:tcMar>
+            <w:vAlign w:val="center"/>
+          </w:tcPr>
+          <w:p>
+            <w:pPr>
+              <w:jc w:val="left"/>
+            </w:pPr>
+            <w:r>
+              <w:rPr>
+                <w:sz w:val="19"/>
+                <w:szCs w:val="19"/>
+              </w:rPr>
+              <w:t xml:space="preserve">Diversidad</w:t>
+            </w:r>
+          </w:p>
+        </w:tc>
+        <w:tc>
+          <w:tcPr>
+            <w:tcW w:type="dxa" w:w="2300"/>
+            <w:tcBorders>
+              <w:top w:val="single" w:color="BFBFBF" w:sz="4"/>
+              <w:left w:val="single" w:color="BFBFBF" w:sz="4"/>
+              <w:bottom w:val="single" w:color="BFBFBF" w:sz="4"/>
+              <w:right w:val="single" w:color="BFBFBF" w:sz="4"/>
+            </w:tcBorders>
+            <w:tcMar>
+              <w:top w:type="dxa" w:w="60"/>
+              <w:left w:type="dxa" w:w="80"/>
+              <w:bottom w:type="dxa" w:w="60"/>
+              <w:right w:type="dxa" w:w="80"/>
+            </w:tcMar>
+            <w:vAlign w:val="center"/>
+          </w:tcPr>
+          <w:p>
+            <w:pPr>
+              <w:jc w:val="left"/>
+            </w:pPr>
+            <w:r>
+              <w:rPr>
+                <w:rFonts w:ascii="Consolas" w:cs="Consolas" w:eastAsia="Consolas" w:hAnsi="Consolas"/>
+                <w:sz w:val="19"/>
+                <w:szCs w:val="19"/>
+              </w:rPr>
+              <w:t xml:space="preserve">diversidad</w:t>
+            </w:r>
+          </w:p>
+        </w:tc>
+        <w:tc>
+          <w:tcPr>
+            <w:tcW w:type="dxa" w:w="5806"/>
+            <w:tcBorders>
+              <w:top w:val="single" w:color="BFBFBF" w:sz="4"/>
+              <w:left w:val="single" w:color="BFBFBF" w:sz="4"/>
+              <w:bottom w:val="single" w:color="BFBFBF" w:sz="4"/>
+              <w:right w:val="single" w:color="BFBFBF" w:sz="4"/>
+            </w:tcBorders>
+            <w:tcMar>
+              <w:top w:type="dxa" w:w="60"/>
+              <w:left w:type="dxa" w:w="80"/>
+              <w:bottom w:type="dxa" w:w="60"/>
+              <w:right w:type="dxa" w:w="80"/>
+            </w:tcMar>
+            <w:vAlign w:val="center"/>
+          </w:tcPr>
+          <w:p>
+            <w:pPr>
+              <w:jc w:val="left"/>
+            </w:pPr>
+            <w:r>
+              <w:rPr>
+                <w:sz w:val="19"/>
+                <w:szCs w:val="19"/>
+              </w:rPr>
+              <w:t xml:space="preserve">Similitud coseno de n-gramas de cada sintético con su vecino más cercano, dentro del lote y contra el phishing real. Arriba de 0.9 cuenta como casi-duplicado interno o como "memorización" de un host real.</w:t>
+            </w:r>
+          </w:p>
+        </w:tc>
+      </w:tr>
+      <w:tr>
+        <w:trPr>
+          <w:tblHeader w:val="false"/>
+        </w:trPr>
+        <w:tc>
+          <w:tcPr>
+            <w:tcW w:type="dxa" w:w="1400"/>
+            <w:tcBorders>
+              <w:top w:val="single" w:color="BFBFBF" w:sz="4"/>
+              <w:left w:val="single" w:color="BFBFBF" w:sz="4"/>
+              <w:bottom w:val="single" w:color="BFBFBF" w:sz="4"/>
+              <w:right w:val="single" w:color="BFBFBF" w:sz="4"/>
+            </w:tcBorders>
+            <w:tcMar>
+              <w:top w:type="dxa" w:w="60"/>
+              <w:left w:type="dxa" w:w="80"/>
+              <w:bottom w:type="dxa" w:w="60"/>
+              <w:right w:type="dxa" w:w="80"/>
+            </w:tcMar>
+            <w:vAlign w:val="center"/>
+          </w:tcPr>
+          <w:p>
+            <w:pPr>
+              <w:jc w:val="left"/>
+            </w:pPr>
+            <w:r>
+              <w:rPr>
+                <w:sz w:val="19"/>
+                <w:szCs w:val="19"/>
+              </w:rPr>
+              <w:t xml:space="preserve">Firma</w:t>
+            </w:r>
+          </w:p>
+        </w:tc>
+        <w:tc>
+          <w:tcPr>
+            <w:tcW w:type="dxa" w:w="2300"/>
+            <w:tcBorders>
+              <w:top w:val="single" w:color="BFBFBF" w:sz="4"/>
+              <w:left w:val="single" w:color="BFBFBF" w:sz="4"/>
+              <w:bottom w:val="single" w:color="BFBFBF" w:sz="4"/>
+              <w:right w:val="single" w:color="BFBFBF" w:sz="4"/>
+            </w:tcBorders>
+            <w:tcMar>
+              <w:top w:type="dxa" w:w="60"/>
+              <w:left w:type="dxa" w:w="80"/>
+              <w:bottom w:type="dxa" w:w="60"/>
+              <w:right w:type="dxa" w:w="80"/>
+            </w:tcMar>
+            <w:vAlign w:val="center"/>
+          </w:tcPr>
+          <w:p>
+            <w:pPr>
+              <w:jc w:val="left"/>
+            </w:pPr>
+            <w:r>
+              <w:rPr>
+                <w:rFonts w:ascii="Consolas" w:cs="Consolas" w:eastAsia="Consolas" w:hAnsi="Consolas"/>
+                <w:sz w:val="19"/>
+                <w:szCs w:val="19"/>
+              </w:rPr>
+              <w:t xml:space="preserve">firma</w:t>
+            </w:r>
+          </w:p>
+        </w:tc>
+        <w:tc>
+          <w:tcPr>
+            <w:tcW w:type="dxa" w:w="5806"/>
+            <w:tcBorders>
+              <w:top w:val="single" w:color="BFBFBF" w:sz="4"/>
+              <w:left w:val="single" w:color="BFBFBF" w:sz="4"/>
+              <w:bottom w:val="single" w:color="BFBFBF" w:sz="4"/>
+              <w:right w:val="single" w:color="BFBFBF" w:sz="4"/>
+            </w:tcBorders>
+            <w:tcMar>
+              <w:top w:type="dxa" w:w="60"/>
+              <w:left w:type="dxa" w:w="80"/>
+              <w:bottom w:type="dxa" w:w="60"/>
+              <w:right w:type="dxa" w:w="80"/>
+            </w:tcMar>
+            <w:vAlign w:val="center"/>
+          </w:tcPr>
+          <w:p>
+            <w:pPr>
+              <w:jc w:val="left"/>
+            </w:pPr>
+            <w:r>
+              <w:rPr>
+                <w:sz w:val="19"/>
+                <w:szCs w:val="19"/>
+              </w:rPr>
+              <w:t xml:space="preserve">Arma un dataset balanceado, mitad sintéticos y mitad phishing real, y entrena dos clasificadores para distinguirlos: regresión logística sobre n-gramas de 1 a 4 caracteres y Random Forest sobre las 20 features. El AUC se mide con validación cruzada de 5 folds. También lista los n-gramas que más delatan al sintético.</w:t>
+            </w:r>
+          </w:p>
+        </w:tc>
+      </w:tr>
+      <w:tr>
+        <w:trPr>
+          <w:tblHeader w:val="false"/>
+        </w:trPr>
+        <w:tc>
+          <w:tcPr>
+            <w:tcW w:type="dxa" w:w="1400"/>
+            <w:tcBorders>
+              <w:top w:val="single" w:color="BFBFBF" w:sz="4"/>
+              <w:left w:val="single" w:color="BFBFBF" w:sz="4"/>
+              <w:bottom w:val="single" w:color="BFBFBF" w:sz="4"/>
+              <w:right w:val="single" w:color="BFBFBF" w:sz="4"/>
+            </w:tcBorders>
+            <w:tcMar>
+              <w:top w:type="dxa" w:w="60"/>
+              <w:left w:type="dxa" w:w="80"/>
+              <w:bottom w:type="dxa" w:w="60"/>
+              <w:right w:type="dxa" w:w="80"/>
+            </w:tcMar>
+            <w:vAlign w:val="center"/>
+          </w:tcPr>
+          <w:p>
+            <w:pPr>
+              <w:jc w:val="left"/>
+            </w:pPr>
+            <w:r>
+              <w:rPr>
+                <w:sz w:val="19"/>
+                <w:szCs w:val="19"/>
+              </w:rPr>
+              <w:t xml:space="preserve">Utilidad</w:t>
+            </w:r>
+          </w:p>
+        </w:tc>
+        <w:tc>
+          <w:tcPr>
+            <w:tcW w:type="dxa" w:w="2300"/>
+            <w:tcBorders>
+              <w:top w:val="single" w:color="BFBFBF" w:sz="4"/>
+              <w:left w:val="single" w:color="BFBFBF" w:sz="4"/>
+              <w:bottom w:val="single" w:color="BFBFBF" w:sz="4"/>
+              <w:right w:val="single" w:color="BFBFBF" w:sz="4"/>
+            </w:tcBorders>
+            <w:tcMar>
+              <w:top w:type="dxa" w:w="60"/>
+              <w:left w:type="dxa" w:w="80"/>
+              <w:bottom w:type="dxa" w:w="60"/>
+              <w:right w:type="dxa" w:w="80"/>
+            </w:tcMar>
+            <w:vAlign w:val="center"/>
+          </w:tcPr>
+          <w:p>
+            <w:pPr>
+              <w:jc w:val="left"/>
+            </w:pPr>
+            <w:r>
+              <w:rPr>
+                <w:rFonts w:ascii="Consolas" w:cs="Consolas" w:eastAsia="Consolas" w:hAnsi="Consolas"/>
+                <w:sz w:val="19"/>
+                <w:szCs w:val="19"/>
+              </w:rPr>
+              <w:t xml:space="preserve">utilidad</w:t>
+            </w:r>
+            <w:r>
+              <w:rPr>
+                <w:sz w:val="19"/>
+                <w:szCs w:val="19"/>
+              </w:rPr>
+              <w:t xml:space="preserve">, </w:t>
+            </w:r>
+            <w:r>
+              <w:rPr>
+                <w:rFonts w:ascii="Consolas" w:cs="Consolas" w:eastAsia="Consolas" w:hAnsi="Consolas"/>
+                <w:sz w:val="19"/>
+                <w:szCs w:val="19"/>
+              </w:rPr>
+              <w:t xml:space="preserve">utilidad_ngramas</w:t>
+            </w:r>
+          </w:p>
+        </w:tc>
+        <w:tc>
+          <w:tcPr>
+            <w:tcW w:type="dxa" w:w="5806"/>
+            <w:tcBorders>
+              <w:top w:val="single" w:color="BFBFBF" w:sz="4"/>
+              <w:left w:val="single" w:color="BFBFBF" w:sz="4"/>
+              <w:bottom w:val="single" w:color="BFBFBF" w:sz="4"/>
+              <w:right w:val="single" w:color="BFBFBF" w:sz="4"/>
+            </w:tcBorders>
+            <w:tcMar>
+              <w:top w:type="dxa" w:w="60"/>
+              <w:left w:type="dxa" w:w="80"/>
+              <w:bottom w:type="dxa" w:w="60"/>
+              <w:right w:type="dxa" w:w="80"/>
+            </w:tcMar>
+            <w:vAlign w:val="center"/>
+          </w:tcPr>
+          <w:p>
+            <w:pPr>
+              <w:jc w:val="left"/>
+            </w:pPr>
+            <w:r>
+              <w:rPr>
+                <w:sz w:val="19"/>
+                <w:szCs w:val="19"/>
+              </w:rPr>
+              <w:t xml:space="preserve">Entrena el detector cuatro veces, con 5 semillas cada una, y lo mide en el </w:t>
+            </w:r>
+            <w:r>
+              <w:rPr>
+                <w:b/>
+                <w:bCs/>
+                <w:sz w:val="19"/>
+                <w:szCs w:val="19"/>
+              </w:rPr>
+              <w:t xml:space="preserve">test real</w:t>
+            </w:r>
+            <w:r>
+              <w:rPr>
+                <w:sz w:val="19"/>
+                <w:szCs w:val="19"/>
+              </w:rPr>
+              <w:t xml:space="preserve">: A solo real; B real + phishing real repetido (sobremuestreo) en la misma cantidad que los sintéticos; C real + sintéticos; D real + moldes difíciles repetidos (solo en v4 y v5). Se hace con dos detectores: Random Forest sobre features (300 árboles, clases balanceadas) y regresión logística sobre TF-IDF de n-gramas de 1 a 4 caracteres.</w:t>
+            </w:r>
+          </w:p>
+        </w:tc>
+      </w:tr>
+    </w:tbl>
+    <w:p/>
+    <w:p>
+      <w:pPr>
+        <w:spacing w:after="160" w:line="300"/>
+        <w:jc w:val="left"/>
+      </w:pPr>
+      <w:r>
+        <w:t xml:space="preserve">Los controles B y D son clave para la interpretación: sin ellos no se podría saber si una mejora viene de la información nueva que aportan los sintéticos o simplemente de tener más ejemplos de la clase phishing. </w:t>
+      </w:r>
+      <w:r>
+        <w:rPr>
+          <w:rFonts w:ascii="Consolas" w:cs="Consolas" w:eastAsia="Consolas" w:hAnsi="Consolas"/>
+        </w:rPr>
+        <w:t xml:space="preserve">veredicto</w:t>
+      </w:r>
+      <w:r>
+        <w:t xml:space="preserve"> resume todo en la tabla OK / REVISAR / FALLA con umbrales fijos: KS mediano ≤ 0.15, firma ≤ 0.75 (FALLA si &gt; 0.9), y ≤ 5% de casi-duplicados y de memorización.</w:t>
+      </w:r>
+    </w:p>
+    <w:p>
+      <w:pPr>
+        <w:pStyle w:val="Heading2"/>
+      </w:pPr>
+      <w:r>
+        <w:t xml:space="preserve">Cómo se probó el generador sin gastar API</w:t>
+      </w:r>
+    </w:p>
+    <w:p>
+      <w:pPr>
+        <w:spacing w:after="160" w:line="300"/>
+        <w:jc w:val="left"/>
+      </w:pPr>
+      <w:r>
+        <w:rPr>
+          <w:rFonts w:ascii="Consolas" w:cs="Consolas" w:eastAsia="Consolas" w:hAnsi="Consolas"/>
+        </w:rPr>
+        <w:t xml:space="preserve">test_generar_sinteticos.py</w:t>
+      </w:r>
+      <w:r>
+        <w:t xml:space="preserve"> levanta un servidor HTTP local que imita la API de Claude. El servidor lee el plan desde el prompt, devuelve un host por fila y mete errores a propósito: una forma cambiada, un hostname inválido y una copia de un lote anterior. Después corre el generador real contra ese servidor y verifica 14 puntos:</w:t>
+      </w:r>
+    </w:p>
+    <w:p>
+      <w:pPr>
+        <w:pStyle w:val="ListParagraph"/>
+        <w:numPr>
+          <w:ilvl w:val="0"/>
+          <w:numId w:val="2"/>
+        </w:numPr>
+        <w:spacing w:after="80"/>
+      </w:pPr>
+      <w:r>
+        <w:t xml:space="preserve">que el pedido use el modelo, el </w:t>
+      </w:r>
+      <w:r>
+        <w:rPr>
+          <w:i/>
+          <w:iCs/>
+        </w:rPr>
+        <w:t xml:space="preserve">effort</w:t>
+      </w:r>
+      <w:r>
+        <w:t xml:space="preserve">, la salida estructurada, el caché y el fallback correctos;</w:t>
+      </w:r>
+    </w:p>
+    <w:p>
+      <w:pPr>
+        <w:pStyle w:val="ListParagraph"/>
+        <w:numPr>
+          <w:ilvl w:val="0"/>
+          <w:numId w:val="2"/>
+        </w:numPr>
+        <w:spacing w:after="80"/>
+      </w:pPr>
+      <w:r>
+        <w:t xml:space="preserve">que la validación descarte exactamente los errores introducidos;</w:t>
+      </w:r>
+    </w:p>
+    <w:p>
+      <w:pPr>
+        <w:pStyle w:val="ListParagraph"/>
+        <w:numPr>
+          <w:ilvl w:val="0"/>
+          <w:numId w:val="2"/>
+        </w:numPr>
+        <w:spacing w:after="80"/>
+      </w:pPr>
+      <w:r>
+        <w:t xml:space="preserve">que al reanudar no se repitan planes;</w:t>
+      </w:r>
+    </w:p>
+    <w:p>
+      <w:pPr>
+        <w:pStyle w:val="ListParagraph"/>
+        <w:numPr>
+          <w:ilvl w:val="0"/>
+          <w:numId w:val="2"/>
+        </w:numPr>
+        <w:spacing w:after="80"/>
+      </w:pPr>
+      <w:r>
+        <w:t xml:space="preserve">que el lote siguiente vea los hosts ya generados;</w:t>
+      </w:r>
+    </w:p>
+    <w:p>
+      <w:pPr>
+        <w:pStyle w:val="ListParagraph"/>
+        <w:numPr>
+          <w:ilvl w:val="0"/>
+          <w:numId w:val="2"/>
+        </w:numPr>
+        <w:spacing w:after="80"/>
+      </w:pPr>
+      <w:r>
+        <w:t xml:space="preserve">que se escriba el reporte de trazabilidad.</w:t>
+      </w:r>
+    </w:p>
+    <w:p>
+      <w:pPr>
+        <w:spacing w:after="160" w:line="300"/>
+        <w:jc w:val="left"/>
+      </w:pPr>
+      <w:r>
+        <w:t xml:space="preserve">El test se corrió después de cada cambio del generador.</w:t>
+      </w:r>
+    </w:p>
+    <w:p>
+      <w:pPr>
+        <w:pStyle w:val="Heading1"/>
+      </w:pPr>
+      <w:r>
+        <w:t xml:space="preserve">Problemas que generan los sintéticos (resumen)</w:t>
+      </w:r>
+    </w:p>
+    <w:p>
+      <w:pPr>
+        <w:pStyle w:val="ListParagraph"/>
+        <w:numPr>
+          <w:ilvl w:val="0"/>
+          <w:numId w:val="4"/>
+        </w:numPr>
+        <w:spacing w:after="80"/>
+      </w:pPr>
+      <w:r>
+        <w:rPr>
+          <w:b/>
+          <w:bCs/>
+        </w:rPr>
+        <w:t xml:space="preserve">Firma del generador</w:t>
+      </w:r>
+      <w:r>
+        <w:t xml:space="preserve">: sin calibración, el LLM produce un estilo propio, reconocible (AUC 0.98).</w:t>
+      </w:r>
+    </w:p>
+    <w:p>
+      <w:pPr>
+        <w:pStyle w:val="ListParagraph"/>
+        <w:numPr>
+          <w:ilvl w:val="0"/>
+          <w:numId w:val="4"/>
+        </w:numPr>
+        <w:spacing w:after="80"/>
+      </w:pPr>
+      <w:r>
+        <w:rPr>
+          <w:b/>
+          <w:bCs/>
+        </w:rPr>
+        <w:t xml:space="preserve">Atajos (shortcut learning)</w:t>
+      </w:r>
+      <w:r>
+        <w:t xml:space="preserve">: el detector puede aprender rasgos del generador en vez de rasgos del phishing, lo que sube los falsos positivos en sitios legítimos con esos rasgos.</w:t>
+      </w:r>
+    </w:p>
+    <w:p>
+      <w:pPr>
+        <w:pStyle w:val="ListParagraph"/>
+        <w:numPr>
+          <w:ilvl w:val="0"/>
+          <w:numId w:val="4"/>
+        </w:numPr>
+        <w:spacing w:after="80"/>
+      </w:pPr>
+      <w:r>
+        <w:rPr>
+          <w:b/>
+          <w:bCs/>
+        </w:rPr>
+        <w:t xml:space="preserve">Redundancia</w:t>
+      </w:r>
+      <w:r>
+        <w:t xml:space="preserve">: si el sintético es indistinguible del real, equivale a sobremuestrear y no aporta información.</w:t>
+      </w:r>
+    </w:p>
+    <w:p>
+      <w:pPr>
+        <w:pStyle w:val="ListParagraph"/>
+        <w:numPr>
+          <w:ilvl w:val="0"/>
+          <w:numId w:val="4"/>
+        </w:numPr>
+        <w:spacing w:after="80"/>
+      </w:pPr>
+      <w:r>
+        <w:rPr>
+          <w:b/>
+          <w:bCs/>
+        </w:rPr>
+        <w:t xml:space="preserve">Desplazamiento de la frontera</w:t>
+      </w:r>
+      <w:r>
+        <w:t xml:space="preserve">: generar alrededor de los casos difíciles empuja al detector hacia la zona de los legítimos (FPR de 9.4% a ~10.5% en el Random Forest).</w:t>
+      </w:r>
+    </w:p>
+    <w:p>
+      <w:pPr>
+        <w:pStyle w:val="ListParagraph"/>
+        <w:numPr>
+          <w:ilvl w:val="0"/>
+          <w:numId w:val="4"/>
+        </w:numPr>
+        <w:spacing w:after="80"/>
+      </w:pPr>
+      <w:r>
+        <w:rPr>
+          <w:b/>
+          <w:bCs/>
+        </w:rPr>
+        <w:t xml:space="preserve">Trazabilidad</w:t>
+      </w:r>
+      <w:r>
+        <w:t xml:space="preserve">: el modelo pedido rechazó los lotes y los sirvió el modelo de respaldo; se registra en cada fila (</w:t>
+      </w:r>
+      <w:r>
+        <w:rPr>
+          <w:rFonts w:ascii="Consolas" w:cs="Consolas" w:eastAsia="Consolas" w:hAnsi="Consolas"/>
+        </w:rPr>
+        <w:t xml:space="preserve">modelo_servido</w:t>
+      </w:r>
+      <w:r>
+        <w:t xml:space="preserve">) y hay que declararlo en la metodología.</w:t>
+      </w:r>
+    </w:p>
+    <w:p>
+      <w:pPr>
+        <w:pStyle w:val="ListParagraph"/>
+        <w:numPr>
+          <w:ilvl w:val="0"/>
+          <w:numId w:val="4"/>
         </w:numPr>
         <w:spacing w:after="80"/>
       </w:pPr>
@@ -3405,6 +5726,15 @@
         <w:ind w:left="720" w:hanging="360"/>
       </w:pPr>
     </w:lvl>
+    <w:lvl w:ilvl="1" w15:tentative="1">
+      <w:start w:val="1"/>
+      <w:numFmt w:val="bullet"/>
+      <w:lvlText w:val="–"/>
+      <w:lvlJc w:val="left"/>
+      <w:pPr>
+        <w:ind w:left="1200" w:hanging="300"/>
+      </w:pPr>
+    </w:lvl>
   </w:abstractNum>
   <w:abstractNum w:abstractNumId="3" w15:restartNumberingAfterBreak="0">
     <w:multiLevelType w:val="hybridMultilevel"/>
@@ -3431,6 +5761,12 @@
     </w:lvlOverride>
   </w:num>
   <w:num w:numId="3">
+    <w:abstractNumId w:val="3"/>
+    <w:lvlOverride w:ilvl="0">
+      <w:startOverride w:val="1"/>
+    </w:lvlOverride>
+  </w:num>
+  <w:num w:numId="4">
     <w:abstractNumId w:val="3"/>
     <w:lvlOverride w:ilvl="0">
       <w:startOverride w:val="1"/>
@@ -3636,6 +5972,23 @@
       <w:szCs w:val="36"/>
     </w:rPr>
   </w:style>
+  <w:style w:type="paragraph" w:styleId="Heading2">
+    <w:name w:val="Heading 2"/>
+    <w:basedOn w:val="Normal"/>
+    <w:next w:val="Normal"/>
+    <w:qFormat/>
+    <w:pPr>
+      <w:spacing w:after="120" w:before="200"/>
+      <w:outlineLvl w:val="1"/>
+    </w:pPr>
+    <w:rPr>
+      <w:b/>
+      <w:bCs/>
+      <w:color w:val="2E5597"/>
+      <w:sz w:val="24"/>
+      <w:szCs w:val="24"/>
+    </w:rPr>
+  </w:style>
   <w:style w:type="paragraph" w:styleId="Heading1">
     <w:name w:val="Heading 1"/>
     <w:basedOn w:val="Normal"/>

</xml_diff>